<commit_message>
Actualizado y completado el documento para el desarrollo del producto. También se agregó en PDF.
</commit_message>
<xml_diff>
--- a/Documentacion/DOC - Plantilla Para Desarrollo de Producto Basada Norma IEEE-830 STD.docx
+++ b/Documentacion/DOC - Plantilla Para Desarrollo de Producto Basada Norma IEEE-830 STD.docx
@@ -122,9 +122,11 @@
       <w:r>
         <w:t xml:space="preserve">Proyecto: </w:t>
       </w:r>
+      <w:proofErr w:type="spellStart"/>
       <w:r>
         <w:t>KiSS</w:t>
       </w:r>
+      <w:proofErr w:type="spellEnd"/>
     </w:p>
     <w:p>
       <w:pPr>
@@ -265,13 +267,13 @@
               <w:jc w:val="center"/>
             </w:pPr>
             <w:r>
+              <w:lastRenderedPageBreak/>
               <w:br/>
             </w:r>
             <w:r>
               <w:rPr>
                 <w:noProof/>
               </w:rPr>
-              <w:lastRenderedPageBreak/>
               <w:drawing>
                 <wp:inline distT="0" distB="0" distL="0" distR="0" wp14:anchorId="2AB13D45" wp14:editId="7EDF2F91">
                   <wp:extent cx="1066800" cy="533400"/>
@@ -455,7 +457,15 @@
         <w:ind w:left="360"/>
       </w:pPr>
       <w:r>
-        <w:t>Está basado y es conforme con el estándar IEEE Std 830-1998</w:t>
+        <w:t xml:space="preserve">Está basado y es conforme con el estándar IEEE </w:t>
+      </w:r>
+      <w:proofErr w:type="spellStart"/>
+      <w:r>
+        <w:t>Std</w:t>
+      </w:r>
+      <w:proofErr w:type="spellEnd"/>
+      <w:r>
+        <w:t xml:space="preserve"> 830-1998</w:t>
       </w:r>
       <w:r>
         <w:t xml:space="preserve"> y</w:t>
@@ -593,7 +603,31 @@
         <w:ind w:left="360"/>
       </w:pPr>
       <w:r>
-        <w:t>La sangría de los textos dentro de cada apartado se genera automáticamente al pulsar Intro al final de la línea de título. (Estilos Normal indentado1, Normal indentado 2 y Normal indentado 3).</w:t>
+        <w:t xml:space="preserve">La sangría de los textos dentro de cada apartado se genera automáticamente al pulsar </w:t>
+      </w:r>
+      <w:proofErr w:type="spellStart"/>
+      <w:r>
+        <w:t>Intro</w:t>
+      </w:r>
+      <w:proofErr w:type="spellEnd"/>
+      <w:r>
+        <w:t xml:space="preserve"> al final de la línea de título. (Estilos Normal indentado1, Normal </w:t>
+      </w:r>
+      <w:proofErr w:type="spellStart"/>
+      <w:r>
+        <w:t>indentado</w:t>
+      </w:r>
+      <w:proofErr w:type="spellEnd"/>
+      <w:r>
+        <w:t xml:space="preserve"> 2 y Normal </w:t>
+      </w:r>
+      <w:proofErr w:type="spellStart"/>
+      <w:r>
+        <w:t>indentado</w:t>
+      </w:r>
+      <w:proofErr w:type="spellEnd"/>
+      <w:r>
+        <w:t xml:space="preserve"> 3).</w:t>
       </w:r>
     </w:p>
     <w:p>
@@ -748,7 +782,21 @@
               <w:rPr>
                 <w:b/>
               </w:rPr>
-              <w:t>Verificado dep. calidad.</w:t>
+              <w:t xml:space="preserve">Verificado </w:t>
+            </w:r>
+            <w:proofErr w:type="spellStart"/>
+            <w:r>
+              <w:rPr>
+                <w:b/>
+              </w:rPr>
+              <w:t>dep</w:t>
+            </w:r>
+            <w:proofErr w:type="spellEnd"/>
+            <w:r>
+              <w:rPr>
+                <w:b/>
+              </w:rPr>
+              <w:t>. calidad.</w:t>
             </w:r>
           </w:p>
         </w:tc>
@@ -1169,8 +1217,33 @@
                 <w:rFonts w:cs="Arial"/>
                 <w:lang w:val="fr-FR"/>
               </w:rPr>
-              <w:t>Por la empresa suministradora</w:t>
-            </w:r>
+              <w:t xml:space="preserve">Por la </w:t>
+            </w:r>
+            <w:proofErr w:type="spellStart"/>
+            <w:r>
+              <w:rPr>
+                <w:rFonts w:cs="Arial"/>
+                <w:lang w:val="fr-FR"/>
+              </w:rPr>
+              <w:t>empresa</w:t>
+            </w:r>
+            <w:proofErr w:type="spellEnd"/>
+            <w:r>
+              <w:rPr>
+                <w:rFonts w:cs="Arial"/>
+                <w:lang w:val="fr-FR"/>
+              </w:rPr>
+              <w:t xml:space="preserve"> </w:t>
+            </w:r>
+            <w:proofErr w:type="spellStart"/>
+            <w:r>
+              <w:rPr>
+                <w:rFonts w:cs="Arial"/>
+                <w:lang w:val="fr-FR"/>
+              </w:rPr>
+              <w:t>suministradora</w:t>
+            </w:r>
+            <w:proofErr w:type="spellEnd"/>
           </w:p>
         </w:tc>
       </w:tr>
@@ -1316,7 +1389,21 @@
               <w:rPr>
                 <w:rFonts w:cs="Arial"/>
               </w:rPr>
-              <w:t xml:space="preserve">Fdo. D./ Dña </w:t>
+              <w:t xml:space="preserve">Fdo. D./ </w:t>
+            </w:r>
+            <w:proofErr w:type="spellStart"/>
+            <w:r>
+              <w:rPr>
+                <w:rFonts w:cs="Arial"/>
+              </w:rPr>
+              <w:t>Dña</w:t>
+            </w:r>
+            <w:proofErr w:type="spellEnd"/>
+            <w:r>
+              <w:rPr>
+                <w:rFonts w:cs="Arial"/>
+              </w:rPr>
+              <w:t xml:space="preserve"> </w:t>
             </w:r>
             <w:r>
               <w:fldChar w:fldCharType="begin"/>
@@ -1357,7 +1444,21 @@
               <w:rPr>
                 <w:rFonts w:cs="Arial"/>
               </w:rPr>
-              <w:t xml:space="preserve">Fdo. D./Dña </w:t>
+              <w:t>Fdo. D./</w:t>
+            </w:r>
+            <w:proofErr w:type="spellStart"/>
+            <w:r>
+              <w:rPr>
+                <w:rFonts w:cs="Arial"/>
+              </w:rPr>
+              <w:t>Dña</w:t>
+            </w:r>
+            <w:proofErr w:type="spellEnd"/>
+            <w:r>
+              <w:rPr>
+                <w:rFonts w:cs="Arial"/>
+              </w:rPr>
+              <w:t xml:space="preserve"> </w:t>
             </w:r>
             <w:r>
               <w:fldChar w:fldCharType="begin"/>
@@ -4758,7 +4859,19 @@
         <w:rPr>
           <w:color w:val="auto"/>
         </w:rPr>
-        <w:t>Este documento esta dirigido a especialistas en los campos de electrónica, software embebido y educación, profesores de diseño.</w:t>
+        <w:t xml:space="preserve">Este documento </w:t>
+      </w:r>
+      <w:r>
+        <w:rPr>
+          <w:color w:val="auto"/>
+        </w:rPr>
+        <w:t>está</w:t>
+      </w:r>
+      <w:r>
+        <w:rPr>
+          <w:color w:val="auto"/>
+        </w:rPr>
+        <w:t xml:space="preserve"> dirigido a especialistas en los campos de electrónica, software embebido y educación, profesores de diseño.</w:t>
       </w:r>
     </w:p>
     <w:p>
@@ -5547,8 +5660,14 @@
       <w:pPr>
         <w:pStyle w:val="guiazul"/>
         <w:ind w:left="600"/>
-      </w:pPr>
-      <w:r>
+        <w:rPr>
+          <w:color w:val="000000" w:themeColor="text1"/>
+        </w:rPr>
+      </w:pPr>
+      <w:r>
+        <w:rPr>
+          <w:color w:val="000000" w:themeColor="text1"/>
+        </w:rPr>
         <w:t>DEP: Documento de especificaciones de Producto</w:t>
       </w:r>
     </w:p>
@@ -5556,9 +5675,644 @@
       <w:pPr>
         <w:pStyle w:val="guiazul"/>
         <w:ind w:left="600"/>
-      </w:pPr>
-      <w:r>
+        <w:rPr>
+          <w:color w:val="000000" w:themeColor="text1"/>
+        </w:rPr>
+      </w:pPr>
+      <w:r>
+        <w:rPr>
+          <w:color w:val="000000" w:themeColor="text1"/>
+        </w:rPr>
         <w:t>PLC: Control Lógico Programable</w:t>
+      </w:r>
+    </w:p>
+    <w:p>
+      <w:pPr>
+        <w:pStyle w:val="guiazul"/>
+        <w:ind w:left="600"/>
+        <w:rPr>
+          <w:color w:val="000000" w:themeColor="text1"/>
+        </w:rPr>
+      </w:pPr>
+      <w:r>
+        <w:rPr>
+          <w:color w:val="000000" w:themeColor="text1"/>
+        </w:rPr>
+        <w:t>AWG (American Wire Gauge): Medida estándar utilizada para clasificar el grosor o calibre de los cables eléctricos (mencionado para las bornas de conexión).</w:t>
+      </w:r>
+    </w:p>
+    <w:p>
+      <w:pPr>
+        <w:pStyle w:val="guiazul"/>
+        <w:ind w:left="600"/>
+        <w:rPr>
+          <w:color w:val="000000" w:themeColor="text1"/>
+        </w:rPr>
+      </w:pPr>
+      <w:r>
+        <w:rPr>
+          <w:color w:val="000000" w:themeColor="text1"/>
+        </w:rPr>
+        <w:t>CAD (</w:t>
+      </w:r>
+      <w:proofErr w:type="spellStart"/>
+      <w:r>
+        <w:rPr>
+          <w:color w:val="000000" w:themeColor="text1"/>
+        </w:rPr>
+        <w:t>Computer</w:t>
+      </w:r>
+      <w:proofErr w:type="spellEnd"/>
+      <w:r>
+        <w:rPr>
+          <w:color w:val="000000" w:themeColor="text1"/>
+        </w:rPr>
+        <w:t xml:space="preserve">-Aided </w:t>
+      </w:r>
+      <w:proofErr w:type="spellStart"/>
+      <w:r>
+        <w:rPr>
+          <w:color w:val="000000" w:themeColor="text1"/>
+        </w:rPr>
+        <w:t>Design</w:t>
+      </w:r>
+      <w:proofErr w:type="spellEnd"/>
+      <w:r>
+        <w:rPr>
+          <w:color w:val="000000" w:themeColor="text1"/>
+        </w:rPr>
+        <w:t>): Diseño Asistido por Computadora.</w:t>
+      </w:r>
+    </w:p>
+    <w:p>
+      <w:pPr>
+        <w:pStyle w:val="guiazul"/>
+        <w:ind w:left="600"/>
+        <w:rPr>
+          <w:color w:val="000000" w:themeColor="text1"/>
+        </w:rPr>
+      </w:pPr>
+      <w:r>
+        <w:rPr>
+          <w:color w:val="000000" w:themeColor="text1"/>
+        </w:rPr>
+        <w:t>DC (Direct Current): Corriente Continua.</w:t>
+      </w:r>
+    </w:p>
+    <w:p>
+      <w:pPr>
+        <w:pStyle w:val="guiazul"/>
+        <w:ind w:left="600"/>
+        <w:rPr>
+          <w:color w:val="000000" w:themeColor="text1"/>
+        </w:rPr>
+      </w:pPr>
+      <w:r>
+        <w:rPr>
+          <w:color w:val="000000" w:themeColor="text1"/>
+        </w:rPr>
+        <w:t>E/S: Entradas y Salidas.</w:t>
+      </w:r>
+    </w:p>
+    <w:p>
+      <w:pPr>
+        <w:pStyle w:val="guiazul"/>
+        <w:ind w:left="600"/>
+        <w:rPr>
+          <w:color w:val="000000" w:themeColor="text1"/>
+        </w:rPr>
+      </w:pPr>
+      <w:r>
+        <w:rPr>
+          <w:color w:val="000000" w:themeColor="text1"/>
+        </w:rPr>
+        <w:t>HMI (Human-Machine Interface): Interfaz Hombre-Máquina, usualmente pantallas industriales para visualizar o controlar procesos.</w:t>
+      </w:r>
+    </w:p>
+    <w:p>
+      <w:pPr>
+        <w:pStyle w:val="guiazul"/>
+        <w:ind w:left="600"/>
+        <w:rPr>
+          <w:color w:val="000000" w:themeColor="text1"/>
+        </w:rPr>
+      </w:pPr>
+      <w:r>
+        <w:rPr>
+          <w:color w:val="000000" w:themeColor="text1"/>
+        </w:rPr>
+        <w:t>IDE (</w:t>
+      </w:r>
+      <w:proofErr w:type="spellStart"/>
+      <w:r>
+        <w:rPr>
+          <w:color w:val="000000" w:themeColor="text1"/>
+        </w:rPr>
+        <w:t>Integrated</w:t>
+      </w:r>
+      <w:proofErr w:type="spellEnd"/>
+      <w:r>
+        <w:rPr>
+          <w:color w:val="000000" w:themeColor="text1"/>
+        </w:rPr>
+        <w:t xml:space="preserve"> </w:t>
+      </w:r>
+      <w:proofErr w:type="spellStart"/>
+      <w:r>
+        <w:rPr>
+          <w:color w:val="000000" w:themeColor="text1"/>
+        </w:rPr>
+        <w:t>Development</w:t>
+      </w:r>
+      <w:proofErr w:type="spellEnd"/>
+      <w:r>
+        <w:rPr>
+          <w:color w:val="000000" w:themeColor="text1"/>
+        </w:rPr>
+        <w:t xml:space="preserve"> </w:t>
+      </w:r>
+      <w:proofErr w:type="spellStart"/>
+      <w:r>
+        <w:rPr>
+          <w:color w:val="000000" w:themeColor="text1"/>
+        </w:rPr>
+        <w:t>Environment</w:t>
+      </w:r>
+      <w:proofErr w:type="spellEnd"/>
+      <w:r>
+        <w:rPr>
+          <w:color w:val="000000" w:themeColor="text1"/>
+        </w:rPr>
+        <w:t>): Entorno de Desarrollo Integrado (como el mencionado IDE de Arduino).</w:t>
+      </w:r>
+    </w:p>
+    <w:p>
+      <w:pPr>
+        <w:pStyle w:val="guiazul"/>
+        <w:ind w:left="600"/>
+        <w:rPr>
+          <w:color w:val="000000" w:themeColor="text1"/>
+        </w:rPr>
+      </w:pPr>
+      <w:r>
+        <w:rPr>
+          <w:color w:val="000000" w:themeColor="text1"/>
+        </w:rPr>
+        <w:t xml:space="preserve">IEC (International </w:t>
+      </w:r>
+      <w:proofErr w:type="spellStart"/>
+      <w:r>
+        <w:rPr>
+          <w:color w:val="000000" w:themeColor="text1"/>
+        </w:rPr>
+        <w:t>Electrotechnical</w:t>
+      </w:r>
+      <w:proofErr w:type="spellEnd"/>
+      <w:r>
+        <w:rPr>
+          <w:color w:val="000000" w:themeColor="text1"/>
+        </w:rPr>
+        <w:t xml:space="preserve"> </w:t>
+      </w:r>
+      <w:proofErr w:type="spellStart"/>
+      <w:r>
+        <w:rPr>
+          <w:color w:val="000000" w:themeColor="text1"/>
+        </w:rPr>
+        <w:t>Commission</w:t>
+      </w:r>
+      <w:proofErr w:type="spellEnd"/>
+      <w:r>
+        <w:rPr>
+          <w:color w:val="000000" w:themeColor="text1"/>
+        </w:rPr>
+        <w:t>): En el contexto del documento (IEC 61131-3), se refiere a la norma internacional que define los lenguajes de programación para autómatas programables.</w:t>
+      </w:r>
+    </w:p>
+    <w:p>
+      <w:pPr>
+        <w:pStyle w:val="guiazul"/>
+        <w:ind w:left="600"/>
+        <w:rPr>
+          <w:color w:val="000000" w:themeColor="text1"/>
+        </w:rPr>
+      </w:pPr>
+      <w:proofErr w:type="spellStart"/>
+      <w:r>
+        <w:rPr>
+          <w:color w:val="000000" w:themeColor="text1"/>
+        </w:rPr>
+        <w:t>IoT</w:t>
+      </w:r>
+      <w:proofErr w:type="spellEnd"/>
+      <w:r>
+        <w:rPr>
+          <w:color w:val="000000" w:themeColor="text1"/>
+        </w:rPr>
+        <w:t xml:space="preserve"> (Internet </w:t>
+      </w:r>
+      <w:proofErr w:type="spellStart"/>
+      <w:r>
+        <w:rPr>
+          <w:color w:val="000000" w:themeColor="text1"/>
+        </w:rPr>
+        <w:t>of</w:t>
+      </w:r>
+      <w:proofErr w:type="spellEnd"/>
+      <w:r>
+        <w:rPr>
+          <w:color w:val="000000" w:themeColor="text1"/>
+        </w:rPr>
+        <w:t xml:space="preserve"> </w:t>
+      </w:r>
+      <w:proofErr w:type="spellStart"/>
+      <w:r>
+        <w:rPr>
+          <w:color w:val="000000" w:themeColor="text1"/>
+        </w:rPr>
+        <w:t>Things</w:t>
+      </w:r>
+      <w:proofErr w:type="spellEnd"/>
+      <w:r>
+        <w:rPr>
+          <w:color w:val="000000" w:themeColor="text1"/>
+        </w:rPr>
+        <w:t>): Internet de las Cosas.</w:t>
+      </w:r>
+    </w:p>
+    <w:p>
+      <w:pPr>
+        <w:pStyle w:val="guiazul"/>
+        <w:ind w:left="600"/>
+        <w:rPr>
+          <w:color w:val="000000" w:themeColor="text1"/>
+        </w:rPr>
+      </w:pPr>
+      <w:r>
+        <w:rPr>
+          <w:color w:val="000000" w:themeColor="text1"/>
+        </w:rPr>
+        <w:lastRenderedPageBreak/>
+        <w:t>ITLA: Instituto Tecnológico de Las Américas.</w:t>
+      </w:r>
+    </w:p>
+    <w:p>
+      <w:pPr>
+        <w:pStyle w:val="guiazul"/>
+        <w:ind w:left="600"/>
+        <w:rPr>
+          <w:color w:val="000000" w:themeColor="text1"/>
+        </w:rPr>
+      </w:pPr>
+      <w:r>
+        <w:rPr>
+          <w:color w:val="000000" w:themeColor="text1"/>
+        </w:rPr>
+        <w:t>LED (Light-</w:t>
+      </w:r>
+      <w:proofErr w:type="spellStart"/>
+      <w:r>
+        <w:rPr>
+          <w:color w:val="000000" w:themeColor="text1"/>
+        </w:rPr>
+        <w:t>Emitting</w:t>
+      </w:r>
+      <w:proofErr w:type="spellEnd"/>
+      <w:r>
+        <w:rPr>
+          <w:color w:val="000000" w:themeColor="text1"/>
+        </w:rPr>
+        <w:t xml:space="preserve"> </w:t>
+      </w:r>
+      <w:proofErr w:type="spellStart"/>
+      <w:r>
+        <w:rPr>
+          <w:color w:val="000000" w:themeColor="text1"/>
+        </w:rPr>
+        <w:t>Diode</w:t>
+      </w:r>
+      <w:proofErr w:type="spellEnd"/>
+      <w:r>
+        <w:rPr>
+          <w:color w:val="000000" w:themeColor="text1"/>
+        </w:rPr>
+        <w:t>): Diodo Emisor de Luz.</w:t>
+      </w:r>
+    </w:p>
+    <w:p>
+      <w:pPr>
+        <w:pStyle w:val="guiazul"/>
+        <w:ind w:left="600"/>
+        <w:rPr>
+          <w:color w:val="000000" w:themeColor="text1"/>
+        </w:rPr>
+      </w:pPr>
+      <w:r>
+        <w:rPr>
+          <w:color w:val="000000" w:themeColor="text1"/>
+        </w:rPr>
+        <w:t>Modbus RTU: Protocolo de comunicación serial de estándar abierto y ampliamente utilizado en la automatización industrial.</w:t>
+      </w:r>
+    </w:p>
+    <w:p>
+      <w:pPr>
+        <w:pStyle w:val="guiazul"/>
+        <w:ind w:left="600"/>
+        <w:rPr>
+          <w:color w:val="000000" w:themeColor="text1"/>
+        </w:rPr>
+      </w:pPr>
+      <w:r>
+        <w:rPr>
+          <w:color w:val="000000" w:themeColor="text1"/>
+        </w:rPr>
+        <w:t>MOSFET (Metal-Oxide-Semiconductor Field-</w:t>
+      </w:r>
+      <w:proofErr w:type="spellStart"/>
+      <w:r>
+        <w:rPr>
+          <w:color w:val="000000" w:themeColor="text1"/>
+        </w:rPr>
+        <w:t>Effect</w:t>
+      </w:r>
+      <w:proofErr w:type="spellEnd"/>
+      <w:r>
+        <w:rPr>
+          <w:color w:val="000000" w:themeColor="text1"/>
+        </w:rPr>
+        <w:t xml:space="preserve"> Transistor): Transistor de efecto de campo semiconductor de óxido metálico, utilizado como interruptor de potencia en las salidas del equipo.</w:t>
+      </w:r>
+    </w:p>
+    <w:p>
+      <w:pPr>
+        <w:pStyle w:val="guiazul"/>
+        <w:ind w:left="600"/>
+        <w:rPr>
+          <w:color w:val="000000" w:themeColor="text1"/>
+        </w:rPr>
+      </w:pPr>
+      <w:r>
+        <w:rPr>
+          <w:color w:val="000000" w:themeColor="text1"/>
+        </w:rPr>
+        <w:t>MQTT (</w:t>
+      </w:r>
+      <w:proofErr w:type="spellStart"/>
+      <w:r>
+        <w:rPr>
+          <w:color w:val="000000" w:themeColor="text1"/>
+        </w:rPr>
+        <w:t>Message</w:t>
+      </w:r>
+      <w:proofErr w:type="spellEnd"/>
+      <w:r>
+        <w:rPr>
+          <w:color w:val="000000" w:themeColor="text1"/>
+        </w:rPr>
+        <w:t xml:space="preserve"> </w:t>
+      </w:r>
+      <w:proofErr w:type="spellStart"/>
+      <w:r>
+        <w:rPr>
+          <w:color w:val="000000" w:themeColor="text1"/>
+        </w:rPr>
+        <w:t>Queuing</w:t>
+      </w:r>
+      <w:proofErr w:type="spellEnd"/>
+      <w:r>
+        <w:rPr>
+          <w:color w:val="000000" w:themeColor="text1"/>
+        </w:rPr>
+        <w:t xml:space="preserve"> </w:t>
+      </w:r>
+      <w:proofErr w:type="spellStart"/>
+      <w:r>
+        <w:rPr>
+          <w:color w:val="000000" w:themeColor="text1"/>
+        </w:rPr>
+        <w:t>Telemetry</w:t>
+      </w:r>
+      <w:proofErr w:type="spellEnd"/>
+      <w:r>
+        <w:rPr>
+          <w:color w:val="000000" w:themeColor="text1"/>
+        </w:rPr>
+        <w:t xml:space="preserve"> </w:t>
+      </w:r>
+      <w:proofErr w:type="spellStart"/>
+      <w:r>
+        <w:rPr>
+          <w:color w:val="000000" w:themeColor="text1"/>
+        </w:rPr>
+        <w:t>Transport</w:t>
+      </w:r>
+      <w:proofErr w:type="spellEnd"/>
+      <w:r>
+        <w:rPr>
+          <w:color w:val="000000" w:themeColor="text1"/>
+        </w:rPr>
+        <w:t xml:space="preserve">): Protocolo de red ligero de mensajería ideal para conexiones </w:t>
+      </w:r>
+      <w:proofErr w:type="spellStart"/>
+      <w:r>
+        <w:rPr>
+          <w:color w:val="000000" w:themeColor="text1"/>
+        </w:rPr>
+        <w:t>IoT</w:t>
+      </w:r>
+      <w:proofErr w:type="spellEnd"/>
+      <w:r>
+        <w:rPr>
+          <w:color w:val="000000" w:themeColor="text1"/>
+        </w:rPr>
+        <w:t xml:space="preserve"> con ancho de banda limitado.</w:t>
+      </w:r>
+    </w:p>
+    <w:p>
+      <w:pPr>
+        <w:pStyle w:val="guiazul"/>
+        <w:ind w:left="600"/>
+        <w:rPr>
+          <w:color w:val="000000" w:themeColor="text1"/>
+        </w:rPr>
+      </w:pPr>
+      <w:r>
+        <w:rPr>
+          <w:color w:val="000000" w:themeColor="text1"/>
+        </w:rPr>
+        <w:t>PCB (</w:t>
+      </w:r>
+      <w:proofErr w:type="spellStart"/>
+      <w:r>
+        <w:rPr>
+          <w:color w:val="000000" w:themeColor="text1"/>
+        </w:rPr>
+        <w:t>Printed</w:t>
+      </w:r>
+      <w:proofErr w:type="spellEnd"/>
+      <w:r>
+        <w:rPr>
+          <w:color w:val="000000" w:themeColor="text1"/>
+        </w:rPr>
+        <w:t xml:space="preserve"> </w:t>
+      </w:r>
+      <w:proofErr w:type="spellStart"/>
+      <w:r>
+        <w:rPr>
+          <w:color w:val="000000" w:themeColor="text1"/>
+        </w:rPr>
+        <w:t>Circuit</w:t>
+      </w:r>
+      <w:proofErr w:type="spellEnd"/>
+      <w:r>
+        <w:rPr>
+          <w:color w:val="000000" w:themeColor="text1"/>
+        </w:rPr>
+        <w:t xml:space="preserve"> Board): Placa de Circuito Impreso.</w:t>
+      </w:r>
+    </w:p>
+    <w:p>
+      <w:pPr>
+        <w:pStyle w:val="guiazul"/>
+        <w:ind w:left="600"/>
+        <w:rPr>
+          <w:color w:val="000000" w:themeColor="text1"/>
+        </w:rPr>
+      </w:pPr>
+      <w:r>
+        <w:rPr>
+          <w:color w:val="000000" w:themeColor="text1"/>
+        </w:rPr>
+        <w:t xml:space="preserve">PM (Project Manager): Gerente o </w:t>
+      </w:r>
+      <w:r>
+        <w:rPr>
+          <w:color w:val="000000" w:themeColor="text1"/>
+        </w:rPr>
+        <w:t>director</w:t>
+      </w:r>
+      <w:r>
+        <w:rPr>
+          <w:color w:val="000000" w:themeColor="text1"/>
+        </w:rPr>
+        <w:t xml:space="preserve"> del Proyecto.</w:t>
+      </w:r>
+    </w:p>
+    <w:p>
+      <w:pPr>
+        <w:pStyle w:val="guiazul"/>
+        <w:ind w:left="600"/>
+        <w:rPr>
+          <w:color w:val="000000" w:themeColor="text1"/>
+        </w:rPr>
+      </w:pPr>
+      <w:r>
+        <w:rPr>
+          <w:color w:val="000000" w:themeColor="text1"/>
+        </w:rPr>
+        <w:t xml:space="preserve">Scan </w:t>
+      </w:r>
+      <w:proofErr w:type="spellStart"/>
+      <w:r>
+        <w:rPr>
+          <w:color w:val="000000" w:themeColor="text1"/>
+        </w:rPr>
+        <w:t>Cycle</w:t>
+      </w:r>
+      <w:proofErr w:type="spellEnd"/>
+      <w:r>
+        <w:rPr>
+          <w:color w:val="000000" w:themeColor="text1"/>
+        </w:rPr>
+        <w:t xml:space="preserve"> (Ciclo de Escaneo): Proceso de lazo cerrado infinito mediante el cual un PLC lee las entradas, ejecuta la lógica programada y actualiza las salidas físicas.</w:t>
+      </w:r>
+    </w:p>
+    <w:p>
+      <w:pPr>
+        <w:pStyle w:val="guiazul"/>
+        <w:ind w:left="600"/>
+        <w:rPr>
+          <w:color w:val="000000" w:themeColor="text1"/>
+        </w:rPr>
+      </w:pPr>
+      <w:r>
+        <w:rPr>
+          <w:color w:val="000000" w:themeColor="text1"/>
+        </w:rPr>
+        <w:t>Shields: Módulos de expansión o tarjetas secundarias apilables que se conectan sobre la placa base para añadir funcionalidades.</w:t>
+      </w:r>
+    </w:p>
+    <w:p>
+      <w:pPr>
+        <w:pStyle w:val="guiazul"/>
+        <w:ind w:left="600"/>
+        <w:rPr>
+          <w:color w:val="000000" w:themeColor="text1"/>
+        </w:rPr>
+      </w:pPr>
+      <w:r>
+        <w:rPr>
+          <w:color w:val="000000" w:themeColor="text1"/>
+        </w:rPr>
+        <w:t>TTL (Transistor-Transistor Logic): Tecnología de circuitos integrados que define estándares para los niveles lógicos de voltaje en los pines de depuración.</w:t>
+      </w:r>
+    </w:p>
+    <w:p>
+      <w:pPr>
+        <w:pStyle w:val="guiazul"/>
+        <w:ind w:left="600"/>
+        <w:rPr>
+          <w:color w:val="000000" w:themeColor="text1"/>
+        </w:rPr>
+      </w:pPr>
+      <w:r>
+        <w:rPr>
+          <w:color w:val="000000" w:themeColor="text1"/>
+        </w:rPr>
+        <w:t xml:space="preserve">UART (Universal </w:t>
+      </w:r>
+      <w:proofErr w:type="spellStart"/>
+      <w:r>
+        <w:rPr>
+          <w:color w:val="000000" w:themeColor="text1"/>
+        </w:rPr>
+        <w:t>Asynchronous</w:t>
+      </w:r>
+      <w:proofErr w:type="spellEnd"/>
+      <w:r>
+        <w:rPr>
+          <w:color w:val="000000" w:themeColor="text1"/>
+        </w:rPr>
+        <w:t xml:space="preserve"> Receiver-</w:t>
+      </w:r>
+      <w:proofErr w:type="spellStart"/>
+      <w:r>
+        <w:rPr>
+          <w:color w:val="000000" w:themeColor="text1"/>
+        </w:rPr>
+        <w:t>Transmitter</w:t>
+      </w:r>
+      <w:proofErr w:type="spellEnd"/>
+      <w:r>
+        <w:rPr>
+          <w:color w:val="000000" w:themeColor="text1"/>
+        </w:rPr>
+        <w:t>): Hardware de comunicación utilizado como puerto de depuración serial.</w:t>
+      </w:r>
+    </w:p>
+    <w:p>
+      <w:pPr>
+        <w:pStyle w:val="guiazul"/>
+        <w:ind w:left="600"/>
+        <w:rPr>
+          <w:color w:val="000000" w:themeColor="text1"/>
+        </w:rPr>
+      </w:pPr>
+      <w:r>
+        <w:rPr>
+          <w:color w:val="000000" w:themeColor="text1"/>
+        </w:rPr>
+        <w:t>USB (Universal Serial Bus): Bus de Serie Universal utilizado para comunicar el microcontrolador con la computadora.</w:t>
       </w:r>
     </w:p>
     <w:p>
@@ -5593,10 +6347,10 @@
       </w:tblPr>
       <w:tblGrid>
         <w:gridCol w:w="1057"/>
-        <w:gridCol w:w="752"/>
+        <w:gridCol w:w="674"/>
         <w:gridCol w:w="6529"/>
-        <w:gridCol w:w="807"/>
-        <w:gridCol w:w="730"/>
+        <w:gridCol w:w="1030"/>
+        <w:gridCol w:w="818"/>
       </w:tblGrid>
       <w:tr>
         <w:trPr>
@@ -5852,22 +6606,7 @@
               <w:ind w:left="0"/>
             </w:pPr>
             <w:r>
-              <w:fldChar w:fldCharType="begin"/>
-            </w:r>
-            <w:r>
-              <w:instrText>MACROBUTTON NoMacro [</w:instrText>
-            </w:r>
-            <w:r>
-              <w:rPr>
-                <w:color w:val="0000FF"/>
-              </w:rPr>
-              <w:instrText>Fecha</w:instrText>
-            </w:r>
-            <w:r>
-              <w:instrText>]</w:instrText>
-            </w:r>
-            <w:r>
-              <w:fldChar w:fldCharType="end"/>
+              <w:t>14/5/2026</w:t>
             </w:r>
           </w:p>
         </w:tc>
@@ -5888,22 +6627,7 @@
               <w:ind w:left="0"/>
             </w:pPr>
             <w:r>
-              <w:fldChar w:fldCharType="begin"/>
-            </w:r>
-            <w:r>
-              <w:instrText>MACROBUTTON NoMacro [</w:instrText>
-            </w:r>
-            <w:r>
-              <w:rPr>
-                <w:color w:val="0000FF"/>
-              </w:rPr>
-              <w:instrText>Autor</w:instrText>
-            </w:r>
-            <w:r>
-              <w:instrText>]</w:instrText>
-            </w:r>
-            <w:r>
-              <w:fldChar w:fldCharType="end"/>
+              <w:t>Josue Herrera</w:t>
             </w:r>
           </w:p>
         </w:tc>
@@ -6016,11 +6740,7 @@
         <w:pStyle w:val="Normalindentado2"/>
       </w:pPr>
       <w:r>
-        <w:t xml:space="preserve">El resto del documento se despliega de la siguiente manera: La Sección 2 ofrece una descripción general del PLC, detallando sus objetivos de enseñanza, su alcance funcional simplificado y los límites de operación del entorno de laboratorio. La Sección 3 </w:t>
-      </w:r>
-      <w:r>
-        <w:lastRenderedPageBreak/>
-        <w:t>profundiza en los requisitos específicos, catalogando las interfaces físicas (hardware), lógicas (software) y de comunicaciones, además de delimitar los requisitos funcionales mediante fichas normalizadas de ingeniería y desglosar las métricas no funcionales de rendimiento, coste de mantenimiento y seguridad eléctrica. Finalmente, la Sección 4 incorpora los apéndices técnicos aclaratorios.</w:t>
+        <w:t>El resto del documento se despliega de la siguiente manera: La Sección 2 ofrece una descripción general del PLC, detallando sus objetivos de enseñanza, su alcance funcional simplificado y los límites de operación del entorno de laboratorio. La Sección 3 profundiza en los requisitos específicos, catalogando las interfaces físicas (hardware), lógicas (software) y de comunicaciones, además de delimitar los requisitos funcionales mediante fichas normalizadas de ingeniería y desglosar las métricas no funcionales de rendimiento, coste de mantenimiento y seguridad eléctrica. Finalmente, la Sección 4 incorpora los apéndices técnicos aclaratorios.</w:t>
       </w:r>
     </w:p>
     <w:p>
@@ -6115,6 +6835,7 @@
         </w:numPr>
       </w:pPr>
       <w:r>
+        <w:lastRenderedPageBreak/>
         <w:t>Acondicionamiento y Lectura de Entradas: Filtrado, aislamiento galvánico y adecuación de señales de diversos tipos (pulsadores, sensores industriales, potenciómetros).</w:t>
       </w:r>
     </w:p>
@@ -6240,22 +6961,7 @@
               <w:ind w:left="0"/>
             </w:pPr>
             <w:r>
-              <w:fldChar w:fldCharType="begin"/>
-            </w:r>
-            <w:r>
-              <w:instrText>MACROBUTTON NoMacro [</w:instrText>
-            </w:r>
-            <w:r>
-              <w:rPr>
-                <w:color w:val="0000FF"/>
-              </w:rPr>
-              <w:instrText>Inserte aquí el texto</w:instrText>
-            </w:r>
-            <w:r>
-              <w:instrText>]</w:instrText>
-            </w:r>
-            <w:r>
-              <w:fldChar w:fldCharType="end"/>
+              <w:t>Docente</w:t>
             </w:r>
           </w:p>
         </w:tc>
@@ -6310,22 +7016,10 @@
               <w:ind w:left="0"/>
             </w:pPr>
             <w:r>
-              <w:fldChar w:fldCharType="begin"/>
-            </w:r>
-            <w:r>
-              <w:instrText>MACROBUTTON NoMacro [</w:instrText>
-            </w:r>
-            <w:r>
-              <w:rPr>
-                <w:color w:val="0000FF"/>
-              </w:rPr>
-              <w:instrText>Inserte aquí el texto</w:instrText>
-            </w:r>
-            <w:r>
-              <w:instrText>]</w:instrText>
-            </w:r>
-            <w:r>
-              <w:fldChar w:fldCharType="end"/>
+              <w:t>Especialistas en electrónica, software embebido y educación</w:t>
+            </w:r>
+            <w:r>
+              <w:t>.</w:t>
             </w:r>
           </w:p>
         </w:tc>
@@ -6380,22 +7074,7 @@
               <w:ind w:left="0"/>
             </w:pPr>
             <w:r>
-              <w:fldChar w:fldCharType="begin"/>
-            </w:r>
-            <w:r>
-              <w:instrText>MACROBUTTON NoMacro [</w:instrText>
-            </w:r>
-            <w:r>
-              <w:rPr>
-                <w:color w:val="0000FF"/>
-              </w:rPr>
-              <w:instrText>Inserte aquí el texto</w:instrText>
-            </w:r>
-            <w:r>
-              <w:instrText>]</w:instrText>
-            </w:r>
-            <w:r>
-              <w:fldChar w:fldCharType="end"/>
+              <w:t>Diseño de hardware/software, diagnóstico de fallas y pedagogía técnica.</w:t>
             </w:r>
           </w:p>
         </w:tc>
@@ -6450,22 +7129,7 @@
               <w:ind w:left="0"/>
             </w:pPr>
             <w:r>
-              <w:fldChar w:fldCharType="begin"/>
-            </w:r>
-            <w:r>
-              <w:instrText>MACROBUTTON NoMacro [</w:instrText>
-            </w:r>
-            <w:r>
-              <w:rPr>
-                <w:color w:val="0000FF"/>
-              </w:rPr>
-              <w:instrText>Inserte aquí el texto</w:instrText>
-            </w:r>
-            <w:r>
-              <w:instrText>]</w:instrText>
-            </w:r>
-            <w:r>
-              <w:fldChar w:fldCharType="end"/>
+              <w:t>Supervisión de laboratorios, evaluación de algoritmos de control y mantenimiento de los equipos didácticos.</w:t>
             </w:r>
           </w:p>
         </w:tc>
@@ -6476,15 +7140,6 @@
         <w:pStyle w:val="guiazul"/>
         <w:ind w:left="708"/>
       </w:pPr>
-    </w:p>
-    <w:p>
-      <w:pPr>
-        <w:pStyle w:val="guiazul"/>
-        <w:ind w:left="708"/>
-      </w:pPr>
-      <w:r>
-        <w:t>Descripción de  los usuarios del producto, incluyendo nivel educacional, experiencia y experiencia técnica.</w:t>
-      </w:r>
     </w:p>
     <w:p>
       <w:pPr>
@@ -6527,7 +7182,15 @@
         </w:numPr>
       </w:pPr>
       <w:r>
-        <w:t>Eléctricas y de Seguridad: Las entradas de voltaje para estudiantes no deben exceder niveles seguros de baja tensión (máximo 24V DC), integrando aislamiento optoacoplado completo para proteger el núcleo del procesador.</w:t>
+        <w:t xml:space="preserve">Eléctricas y de Seguridad: Las entradas de voltaje para estudiantes no deben exceder niveles seguros de baja tensión (máximo 24V DC), integrando aislamiento </w:t>
+      </w:r>
+      <w:proofErr w:type="spellStart"/>
+      <w:r>
+        <w:t>optoacoplado</w:t>
+      </w:r>
+      <w:proofErr w:type="spellEnd"/>
+      <w:r>
+        <w:t xml:space="preserve"> completo para proteger el núcleo del procesador.</w:t>
       </w:r>
     </w:p>
     <w:p>
@@ -6545,7 +7208,15 @@
         </w:numPr>
       </w:pPr>
       <w:r>
-        <w:t>Lenguajes y Programación: Debe ser programable a través de herramientas de código abierto o software libre (como el IDE de Arduino o extensiones PlatformIO), evitando licencias comerciales restrictivas.</w:t>
+        <w:t xml:space="preserve">Lenguajes y Programación: Debe ser programable a través de herramientas de código abierto o software libre (como el IDE de Arduino o extensiones </w:t>
+      </w:r>
+      <w:proofErr w:type="spellStart"/>
+      <w:r>
+        <w:t>PlatformIO</w:t>
+      </w:r>
+      <w:proofErr w:type="spellEnd"/>
+      <w:r>
+        <w:t>), evitando licencias comerciales restrictivas.</w:t>
       </w:r>
     </w:p>
     <w:p>
@@ -6563,7 +7234,6 @@
         </w:numPr>
       </w:pPr>
       <w:r>
-        <w:lastRenderedPageBreak/>
         <w:t>Entorno de Trabajo: El hardware debe operar de manera confiable en ambientes sin aire acondicionado industrial, expuesto al polvo del taller y manipulación ruda continua.</w:t>
       </w:r>
     </w:p>
@@ -6607,10 +7277,15 @@
         </w:numPr>
       </w:pPr>
       <w:r>
-        <w:t>El desarrollo del firmware y las bibliotecas de abstracción dependen de la estabilidad y permanencia del repositorio git del proyecto hospedado en GitHub</w:t>
-      </w:r>
-      <w:r>
-        <w:t>.</w:t>
+        <w:t xml:space="preserve">El desarrollo del firmware y las bibliotecas de abstracción dependen de la estabilidad y permanencia del repositorio </w:t>
+      </w:r>
+      <w:proofErr w:type="spellStart"/>
+      <w:r>
+        <w:t>git</w:t>
+      </w:r>
+      <w:proofErr w:type="spellEnd"/>
+      <w:r>
+        <w:t xml:space="preserve"> del proyecto hospedado en GitHub.</w:t>
       </w:r>
     </w:p>
     <w:p>
@@ -6653,7 +7328,15 @@
         </w:numPr>
       </w:pPr>
       <w:r>
-        <w:t>Módulos de Expansión (Shields): Diseño de tarjetas secundarias apilables para añadir conectividad inalámbrica (Wi-Fi/Bluetooth) o módulos de relés de mayor amperaje.</w:t>
+        <w:t>Módulos de Expansión (Shields): Diseño de tarjetas secundarias apilables para añadir conectividad inalámbrica (</w:t>
+      </w:r>
+      <w:proofErr w:type="spellStart"/>
+      <w:r>
+        <w:t>Wi</w:t>
+      </w:r>
+      <w:proofErr w:type="spellEnd"/>
+      <w:r>
+        <w:t>-Fi/Bluetooth) o módulos de relés de mayor amperaje.</w:t>
       </w:r>
     </w:p>
     <w:p>
@@ -6670,6 +7353,7 @@
         </w:numPr>
       </w:pPr>
       <w:r>
+        <w:lastRenderedPageBreak/>
         <w:t>Cumplimiento de Estándar Industrial: Migración del firmware de control hacia un entorno de ejecución conforme con IEC 61131-3 (Diagrama de Escalera/Ladder, Bloques de Funciones) ejecutable de manera nativa sobre el procesador educativo.</w:t>
       </w:r>
     </w:p>
@@ -6687,7 +7371,15 @@
         </w:numPr>
       </w:pPr>
       <w:r>
-        <w:t>Integración IoT: Implementación de protocolos ligeros de comunicación (como MQTT) para proyectos de telemetría y manufactura inteligente dentro de los laboratorios avanzados.</w:t>
+        <w:t xml:space="preserve">Integración </w:t>
+      </w:r>
+      <w:proofErr w:type="spellStart"/>
+      <w:r>
+        <w:t>IoT</w:t>
+      </w:r>
+      <w:proofErr w:type="spellEnd"/>
+      <w:r>
+        <w:t>: Implementación de protocolos ligeros de comunicación (como MQTT) para proyectos de telemetría y manufactura inteligente dentro de los laboratorios avanzados.</w:t>
       </w:r>
     </w:p>
     <w:p>
@@ -6703,69 +7395,6 @@
       <w:bookmarkEnd w:id="35"/>
       <w:bookmarkEnd w:id="36"/>
       <w:bookmarkEnd w:id="37"/>
-    </w:p>
-    <w:p>
-      <w:pPr>
-        <w:pStyle w:val="guiazul"/>
-        <w:ind w:left="360"/>
-      </w:pPr>
-      <w:r>
-        <w:t>Est</w:t>
-      </w:r>
-      <w:r>
-        <w:t>a es la sección más extensa y má</w:t>
-      </w:r>
-      <w:r>
-        <w:t xml:space="preserve">s importante del documento. </w:t>
-      </w:r>
-    </w:p>
-    <w:p>
-      <w:pPr>
-        <w:pStyle w:val="guiazul"/>
-        <w:ind w:left="360"/>
-      </w:pPr>
-      <w:r>
-        <w:t>Debe contener una lista detallada y completa de los requisitos que debe cumplir el sistema a desarrollar. El nivel de detalle de los requisitos debe ser el suficie</w:t>
-      </w:r>
-      <w:r>
-        <w:t>nte para que el equipo de desarrollo pueda</w:t>
-      </w:r>
-      <w:r>
-        <w:t xml:space="preserve"> diseñar un sistema que satisfaga los requisitos y los encargados de las pruebas puedan determinar si éstos se satisfacen.</w:t>
-      </w:r>
-    </w:p>
-    <w:p>
-      <w:pPr>
-        <w:pStyle w:val="guiazul"/>
-        <w:ind w:left="360"/>
-      </w:pPr>
-    </w:p>
-    <w:p>
-      <w:pPr>
-        <w:pStyle w:val="guiazul"/>
-        <w:ind w:left="360"/>
-      </w:pPr>
-      <w:r>
-        <w:t xml:space="preserve">Los requisitos se dispondrán en forma de listas numeradas para su identificación, seguimiento, trazabilidad y validación (ej. </w:t>
-      </w:r>
-      <w:r>
-        <w:t>RF 10, RF 10.1, RF 10.2,...).</w:t>
-      </w:r>
-    </w:p>
-    <w:p>
-      <w:pPr>
-        <w:pStyle w:val="guiazul"/>
-        <w:ind w:left="360"/>
-      </w:pPr>
-    </w:p>
-    <w:p>
-      <w:pPr>
-        <w:pStyle w:val="guiazul"/>
-        <w:ind w:left="360"/>
-      </w:pPr>
-      <w:r>
-        <w:t>Para cada requisito debe completarse la siguiente tabla:</w:t>
-      </w:r>
     </w:p>
     <w:p>
       <w:pPr>
@@ -6857,22 +7486,7 @@
               <w:fldChar w:fldCharType="end"/>
             </w:r>
             <w:r>
-              <w:fldChar w:fldCharType="begin"/>
-            </w:r>
-            <w:r>
-              <w:instrText>MACROBUTTON NoMacro [</w:instrText>
-            </w:r>
-            <w:r>
-              <w:rPr>
-                <w:color w:val="0000FF"/>
-              </w:rPr>
-              <w:instrText>Inserte aquí el texto</w:instrText>
-            </w:r>
-            <w:r>
-              <w:instrText>]</w:instrText>
-            </w:r>
-            <w:r>
-              <w:fldChar w:fldCharType="end"/>
+              <w:t>RF 1</w:t>
             </w:r>
           </w:p>
         </w:tc>
@@ -6930,22 +7544,15 @@
               <w:ind w:left="0"/>
             </w:pPr>
             <w:r>
-              <w:fldChar w:fldCharType="begin"/>
-            </w:r>
-            <w:r>
-              <w:instrText>MACROBUTTON NoMacro [</w:instrText>
-            </w:r>
-            <w:r>
-              <w:rPr>
-                <w:color w:val="0000FF"/>
-              </w:rPr>
-              <w:instrText>Inserte aquí el texto</w:instrText>
-            </w:r>
-            <w:r>
-              <w:instrText>]</w:instrText>
-            </w:r>
-            <w:r>
-              <w:fldChar w:fldCharType="end"/>
+              <w:t xml:space="preserve">Arquitectura de Lazo Cerrado (Scan </w:t>
+            </w:r>
+            <w:proofErr w:type="spellStart"/>
+            <w:r>
+              <w:t>Cycle</w:t>
+            </w:r>
+            <w:proofErr w:type="spellEnd"/>
+            <w:r>
+              <w:t>)</w:t>
             </w:r>
           </w:p>
         </w:tc>
@@ -7008,7 +7615,7 @@
                   <w:calcOnExit w:val="0"/>
                   <w:checkBox>
                     <w:sizeAuto/>
-                    <w:default w:val="0"/>
+                    <w:default w:val="1"/>
                   </w:checkBox>
                 </w:ffData>
               </w:fldChar>
@@ -7126,22 +7733,7 @@
               <w:ind w:left="0"/>
             </w:pPr>
             <w:r>
-              <w:fldChar w:fldCharType="begin"/>
-            </w:r>
-            <w:r>
-              <w:instrText>MACROBUTTON NoMacro [</w:instrText>
-            </w:r>
-            <w:r>
-              <w:rPr>
-                <w:color w:val="0000FF"/>
-              </w:rPr>
-              <w:instrText>Inserte aquí el texto</w:instrText>
-            </w:r>
-            <w:r>
-              <w:instrText>]</w:instrText>
-            </w:r>
-            <w:r>
-              <w:fldChar w:fldCharType="end"/>
+              <w:t>Diseño de Software</w:t>
             </w:r>
           </w:p>
         </w:tc>
@@ -7205,7 +7797,7 @@
                   <w:calcOnExit w:val="0"/>
                   <w:checkBox>
                     <w:sizeAuto/>
-                    <w:default w:val="0"/>
+                    <w:default w:val="1"/>
                   </w:checkBox>
                 </w:ffData>
               </w:fldChar>
@@ -7318,14 +7910,503 @@
         <w:ind w:left="360"/>
       </w:pPr>
     </w:p>
+    <w:tbl>
+      <w:tblPr>
+        <w:tblW w:w="0" w:type="auto"/>
+        <w:tblInd w:w="430" w:type="dxa"/>
+        <w:tblBorders>
+          <w:top w:val="single" w:sz="4" w:space="0" w:color="auto"/>
+          <w:left w:val="single" w:sz="4" w:space="0" w:color="auto"/>
+          <w:bottom w:val="single" w:sz="4" w:space="0" w:color="auto"/>
+          <w:insideH w:val="single" w:sz="4" w:space="0" w:color="auto"/>
+        </w:tblBorders>
+        <w:tblCellMar>
+          <w:left w:w="70" w:type="dxa"/>
+          <w:right w:w="70" w:type="dxa"/>
+        </w:tblCellMar>
+        <w:tblLook w:val="0000" w:firstRow="0" w:lastRow="0" w:firstColumn="0" w:lastColumn="0" w:noHBand="0" w:noVBand="0"/>
+      </w:tblPr>
+      <w:tblGrid>
+        <w:gridCol w:w="2449"/>
+        <w:gridCol w:w="1786"/>
+        <w:gridCol w:w="1969"/>
+        <w:gridCol w:w="1860"/>
+      </w:tblGrid>
+      <w:tr>
+        <w:tc>
+          <w:tcPr>
+            <w:tcW w:w="2490" w:type="dxa"/>
+            <w:tcBorders>
+              <w:right w:val="double" w:sz="4" w:space="0" w:color="auto"/>
+            </w:tcBorders>
+            <w:shd w:val="clear" w:color="auto" w:fill="EAEAEA"/>
+            <w:tcMar>
+              <w:left w:w="40" w:type="dxa"/>
+              <w:bottom w:w="17" w:type="dxa"/>
+              <w:right w:w="40" w:type="dxa"/>
+            </w:tcMar>
+          </w:tcPr>
+          <w:p>
+            <w:pPr>
+              <w:pStyle w:val="guiazul"/>
+              <w:rPr>
+                <w:i w:val="0"/>
+                <w:iCs/>
+                <w:color w:val="auto"/>
+              </w:rPr>
+            </w:pPr>
+            <w:r>
+              <w:rPr>
+                <w:i w:val="0"/>
+                <w:iCs/>
+                <w:color w:val="auto"/>
+              </w:rPr>
+              <w:t>Número de requisito</w:t>
+            </w:r>
+          </w:p>
+        </w:tc>
+        <w:tc>
+          <w:tcPr>
+            <w:tcW w:w="5664" w:type="dxa"/>
+            <w:gridSpan w:val="3"/>
+            <w:tcBorders>
+              <w:left w:val="double" w:sz="4" w:space="0" w:color="auto"/>
+              <w:right w:val="single" w:sz="4" w:space="0" w:color="auto"/>
+            </w:tcBorders>
+            <w:tcMar>
+              <w:left w:w="40" w:type="dxa"/>
+              <w:bottom w:w="17" w:type="dxa"/>
+              <w:right w:w="40" w:type="dxa"/>
+            </w:tcMar>
+          </w:tcPr>
+          <w:p>
+            <w:pPr>
+              <w:pStyle w:val="Normalindentado1"/>
+              <w:ind w:left="0"/>
+            </w:pPr>
+            <w:r>
+              <w:fldChar w:fldCharType="begin"/>
+            </w:r>
+            <w:r>
+              <w:instrText xml:space="preserve"> MACROBUTTON </w:instrText>
+            </w:r>
+            <w:r>
+              <w:fldChar w:fldCharType="end"/>
+            </w:r>
+            <w:r>
+              <w:t xml:space="preserve">RF </w:t>
+            </w:r>
+            <w:r>
+              <w:t>2</w:t>
+            </w:r>
+          </w:p>
+        </w:tc>
+      </w:tr>
+      <w:tr>
+        <w:tc>
+          <w:tcPr>
+            <w:tcW w:w="2490" w:type="dxa"/>
+            <w:tcBorders>
+              <w:right w:val="double" w:sz="4" w:space="0" w:color="auto"/>
+            </w:tcBorders>
+            <w:shd w:val="clear" w:color="auto" w:fill="EAEAEA"/>
+            <w:tcMar>
+              <w:left w:w="40" w:type="dxa"/>
+              <w:bottom w:w="17" w:type="dxa"/>
+              <w:right w:w="40" w:type="dxa"/>
+            </w:tcMar>
+          </w:tcPr>
+          <w:p>
+            <w:pPr>
+              <w:pStyle w:val="guiazul"/>
+              <w:rPr>
+                <w:i w:val="0"/>
+                <w:iCs/>
+                <w:color w:val="auto"/>
+              </w:rPr>
+            </w:pPr>
+            <w:r>
+              <w:rPr>
+                <w:i w:val="0"/>
+                <w:iCs/>
+                <w:color w:val="auto"/>
+              </w:rPr>
+              <w:t>Nombre de requisito</w:t>
+            </w:r>
+          </w:p>
+        </w:tc>
+        <w:tc>
+          <w:tcPr>
+            <w:tcW w:w="5664" w:type="dxa"/>
+            <w:gridSpan w:val="3"/>
+            <w:tcBorders>
+              <w:left w:val="double" w:sz="4" w:space="0" w:color="auto"/>
+              <w:right w:val="single" w:sz="4" w:space="0" w:color="auto"/>
+            </w:tcBorders>
+            <w:tcMar>
+              <w:left w:w="40" w:type="dxa"/>
+              <w:bottom w:w="17" w:type="dxa"/>
+              <w:right w:w="40" w:type="dxa"/>
+            </w:tcMar>
+          </w:tcPr>
+          <w:p>
+            <w:pPr>
+              <w:pStyle w:val="Normalindentado1"/>
+              <w:ind w:left="0"/>
+            </w:pPr>
+            <w:r>
+              <w:t xml:space="preserve">Aislamiento </w:t>
+            </w:r>
+            <w:proofErr w:type="spellStart"/>
+            <w:r>
+              <w:t>Optoacoplado</w:t>
+            </w:r>
+            <w:proofErr w:type="spellEnd"/>
+          </w:p>
+        </w:tc>
+      </w:tr>
+      <w:tr>
+        <w:tc>
+          <w:tcPr>
+            <w:tcW w:w="2490" w:type="dxa"/>
+            <w:tcBorders>
+              <w:right w:val="double" w:sz="4" w:space="0" w:color="auto"/>
+            </w:tcBorders>
+            <w:shd w:val="clear" w:color="auto" w:fill="EAEAEA"/>
+            <w:tcMar>
+              <w:left w:w="40" w:type="dxa"/>
+              <w:bottom w:w="17" w:type="dxa"/>
+              <w:right w:w="40" w:type="dxa"/>
+            </w:tcMar>
+          </w:tcPr>
+          <w:p>
+            <w:pPr>
+              <w:pStyle w:val="guiazul"/>
+              <w:rPr>
+                <w:i w:val="0"/>
+                <w:iCs/>
+                <w:color w:val="auto"/>
+              </w:rPr>
+            </w:pPr>
+            <w:r>
+              <w:rPr>
+                <w:i w:val="0"/>
+                <w:iCs/>
+                <w:color w:val="auto"/>
+              </w:rPr>
+              <w:t>Tipo</w:t>
+            </w:r>
+          </w:p>
+        </w:tc>
+        <w:tc>
+          <w:tcPr>
+            <w:tcW w:w="1800" w:type="dxa"/>
+            <w:tcBorders>
+              <w:left w:val="double" w:sz="4" w:space="0" w:color="auto"/>
+            </w:tcBorders>
+            <w:tcMar>
+              <w:left w:w="40" w:type="dxa"/>
+              <w:bottom w:w="17" w:type="dxa"/>
+              <w:right w:w="40" w:type="dxa"/>
+            </w:tcMar>
+          </w:tcPr>
+          <w:p>
+            <w:pPr>
+              <w:pStyle w:val="Normalindentado1"/>
+              <w:ind w:left="0"/>
+            </w:pPr>
+            <w:r>
+              <w:fldChar w:fldCharType="begin">
+                <w:ffData>
+                  <w:name w:val=""/>
+                  <w:enabled/>
+                  <w:calcOnExit w:val="0"/>
+                  <w:checkBox>
+                    <w:sizeAuto/>
+                    <w:default w:val="0"/>
+                  </w:checkBox>
+                </w:ffData>
+              </w:fldChar>
+            </w:r>
+            <w:r>
+              <w:instrText xml:space="preserve"> FORMCHECKBOX </w:instrText>
+            </w:r>
+            <w:r>
+              <w:fldChar w:fldCharType="separate"/>
+            </w:r>
+            <w:r>
+              <w:fldChar w:fldCharType="end"/>
+            </w:r>
+            <w:r>
+              <w:t xml:space="preserve"> Requisito</w:t>
+            </w:r>
+          </w:p>
+        </w:tc>
+        <w:tc>
+          <w:tcPr>
+            <w:tcW w:w="3864" w:type="dxa"/>
+            <w:gridSpan w:val="2"/>
+            <w:tcBorders>
+              <w:right w:val="single" w:sz="4" w:space="0" w:color="auto"/>
+            </w:tcBorders>
+          </w:tcPr>
+          <w:p>
+            <w:pPr>
+              <w:pStyle w:val="Normalindentado1"/>
+              <w:ind w:left="0"/>
+            </w:pPr>
+            <w:r>
+              <w:fldChar w:fldCharType="begin">
+                <w:ffData>
+                  <w:name w:val=""/>
+                  <w:enabled/>
+                  <w:calcOnExit w:val="0"/>
+                  <w:checkBox>
+                    <w:sizeAuto/>
+                    <w:default w:val="1"/>
+                  </w:checkBox>
+                </w:ffData>
+              </w:fldChar>
+            </w:r>
+            <w:r>
+              <w:instrText xml:space="preserve"> FORMCHECKBOX </w:instrText>
+            </w:r>
+            <w:r>
+              <w:fldChar w:fldCharType="separate"/>
+            </w:r>
+            <w:r>
+              <w:fldChar w:fldCharType="end"/>
+            </w:r>
+            <w:r>
+              <w:t xml:space="preserve"> Restricción</w:t>
+            </w:r>
+          </w:p>
+        </w:tc>
+      </w:tr>
+      <w:tr>
+        <w:tc>
+          <w:tcPr>
+            <w:tcW w:w="2490" w:type="dxa"/>
+            <w:tcBorders>
+              <w:right w:val="double" w:sz="4" w:space="0" w:color="auto"/>
+            </w:tcBorders>
+            <w:shd w:val="clear" w:color="auto" w:fill="EAEAEA"/>
+            <w:tcMar>
+              <w:left w:w="40" w:type="dxa"/>
+              <w:bottom w:w="17" w:type="dxa"/>
+              <w:right w:w="40" w:type="dxa"/>
+            </w:tcMar>
+          </w:tcPr>
+          <w:p>
+            <w:pPr>
+              <w:pStyle w:val="guiazul"/>
+              <w:rPr>
+                <w:i w:val="0"/>
+                <w:iCs/>
+                <w:color w:val="auto"/>
+              </w:rPr>
+            </w:pPr>
+            <w:r>
+              <w:rPr>
+                <w:i w:val="0"/>
+                <w:iCs/>
+                <w:color w:val="auto"/>
+              </w:rPr>
+              <w:t>Fuente del requisito</w:t>
+            </w:r>
+          </w:p>
+        </w:tc>
+        <w:tc>
+          <w:tcPr>
+            <w:tcW w:w="5664" w:type="dxa"/>
+            <w:gridSpan w:val="3"/>
+            <w:tcBorders>
+              <w:left w:val="double" w:sz="4" w:space="0" w:color="auto"/>
+              <w:bottom w:val="single" w:sz="4" w:space="0" w:color="auto"/>
+              <w:right w:val="single" w:sz="4" w:space="0" w:color="auto"/>
+            </w:tcBorders>
+            <w:tcMar>
+              <w:left w:w="40" w:type="dxa"/>
+              <w:bottom w:w="17" w:type="dxa"/>
+              <w:right w:w="40" w:type="dxa"/>
+            </w:tcMar>
+          </w:tcPr>
+          <w:p>
+            <w:pPr>
+              <w:pStyle w:val="Normalindentado1"/>
+              <w:ind w:left="0"/>
+            </w:pPr>
+            <w:r>
+              <w:t>Diseño de Hardware</w:t>
+            </w:r>
+          </w:p>
+        </w:tc>
+      </w:tr>
+      <w:tr>
+        <w:tc>
+          <w:tcPr>
+            <w:tcW w:w="2490" w:type="dxa"/>
+            <w:tcBorders>
+              <w:right w:val="double" w:sz="4" w:space="0" w:color="auto"/>
+            </w:tcBorders>
+            <w:shd w:val="clear" w:color="auto" w:fill="EAEAEA"/>
+            <w:tcMar>
+              <w:left w:w="40" w:type="dxa"/>
+              <w:bottom w:w="17" w:type="dxa"/>
+              <w:right w:w="40" w:type="dxa"/>
+            </w:tcMar>
+          </w:tcPr>
+          <w:p>
+            <w:pPr>
+              <w:pStyle w:val="guiazul"/>
+              <w:rPr>
+                <w:i w:val="0"/>
+                <w:iCs/>
+                <w:color w:val="auto"/>
+              </w:rPr>
+            </w:pPr>
+            <w:r>
+              <w:rPr>
+                <w:i w:val="0"/>
+                <w:iCs/>
+                <w:color w:val="auto"/>
+              </w:rPr>
+              <w:t>Prioridad del requisito</w:t>
+            </w:r>
+          </w:p>
+        </w:tc>
+        <w:tc>
+          <w:tcPr>
+            <w:tcW w:w="1800" w:type="dxa"/>
+            <w:tcBorders>
+              <w:left w:val="double" w:sz="4" w:space="0" w:color="auto"/>
+              <w:right w:val="nil"/>
+            </w:tcBorders>
+            <w:tcMar>
+              <w:left w:w="40" w:type="dxa"/>
+              <w:bottom w:w="17" w:type="dxa"/>
+              <w:right w:w="40" w:type="dxa"/>
+            </w:tcMar>
+          </w:tcPr>
+          <w:p>
+            <w:pPr>
+              <w:pStyle w:val="Normalindentado1"/>
+              <w:ind w:left="0"/>
+            </w:pPr>
+            <w:r>
+              <w:fldChar w:fldCharType="begin">
+                <w:ffData>
+                  <w:name w:val="Casilla3"/>
+                  <w:enabled/>
+                  <w:calcOnExit w:val="0"/>
+                  <w:checkBox>
+                    <w:sizeAuto/>
+                    <w:default w:val="1"/>
+                  </w:checkBox>
+                </w:ffData>
+              </w:fldChar>
+            </w:r>
+            <w:r>
+              <w:instrText xml:space="preserve"> FORMCHECKBOX </w:instrText>
+            </w:r>
+            <w:r>
+              <w:fldChar w:fldCharType="separate"/>
+            </w:r>
+            <w:r>
+              <w:fldChar w:fldCharType="end"/>
+            </w:r>
+            <w:r>
+              <w:t xml:space="preserve"> Alta/Esencial</w:t>
+            </w:r>
+          </w:p>
+        </w:tc>
+        <w:tc>
+          <w:tcPr>
+            <w:tcW w:w="1980" w:type="dxa"/>
+            <w:tcBorders>
+              <w:left w:val="nil"/>
+              <w:right w:val="nil"/>
+            </w:tcBorders>
+          </w:tcPr>
+          <w:p>
+            <w:pPr>
+              <w:pStyle w:val="Normalindentado1"/>
+              <w:ind w:left="0"/>
+            </w:pPr>
+            <w:r>
+              <w:fldChar w:fldCharType="begin">
+                <w:ffData>
+                  <w:name w:val="Casilla4"/>
+                  <w:enabled/>
+                  <w:calcOnExit w:val="0"/>
+                  <w:checkBox>
+                    <w:sizeAuto/>
+                    <w:default w:val="0"/>
+                  </w:checkBox>
+                </w:ffData>
+              </w:fldChar>
+            </w:r>
+            <w:r>
+              <w:instrText xml:space="preserve"> FORMCHECKBOX </w:instrText>
+            </w:r>
+            <w:r>
+              <w:fldChar w:fldCharType="separate"/>
+            </w:r>
+            <w:r>
+              <w:fldChar w:fldCharType="end"/>
+            </w:r>
+            <w:r>
+              <w:t xml:space="preserve"> Media/Deseado</w:t>
+            </w:r>
+          </w:p>
+        </w:tc>
+        <w:tc>
+          <w:tcPr>
+            <w:tcW w:w="1884" w:type="dxa"/>
+            <w:tcBorders>
+              <w:left w:val="nil"/>
+              <w:right w:val="single" w:sz="4" w:space="0" w:color="auto"/>
+            </w:tcBorders>
+          </w:tcPr>
+          <w:p>
+            <w:pPr>
+              <w:pStyle w:val="Normalindentado1"/>
+              <w:ind w:left="0"/>
+            </w:pPr>
+            <w:r>
+              <w:fldChar w:fldCharType="begin">
+                <w:ffData>
+                  <w:name w:val="Casilla5"/>
+                  <w:enabled/>
+                  <w:calcOnExit w:val="0"/>
+                  <w:checkBox>
+                    <w:sizeAuto/>
+                    <w:default w:val="0"/>
+                  </w:checkBox>
+                </w:ffData>
+              </w:fldChar>
+            </w:r>
+            <w:r>
+              <w:instrText xml:space="preserve"> FORMCHECKBOX </w:instrText>
+            </w:r>
+            <w:r>
+              <w:fldChar w:fldCharType="separate"/>
+            </w:r>
+            <w:r>
+              <w:fldChar w:fldCharType="end"/>
+            </w:r>
+            <w:r>
+              <w:t xml:space="preserve"> Baja/ Opcional</w:t>
+            </w:r>
+          </w:p>
+        </w:tc>
+      </w:tr>
+    </w:tbl>
     <w:p>
       <w:pPr>
         <w:pStyle w:val="guiazul"/>
         <w:ind w:left="360"/>
       </w:pPr>
-      <w:r>
-        <w:t>y realizar la descripción del requisito</w:t>
-      </w:r>
     </w:p>
     <w:p>
       <w:pPr>
@@ -7333,14 +8414,991 @@
         <w:ind w:left="360"/>
       </w:pPr>
     </w:p>
+    <w:tbl>
+      <w:tblPr>
+        <w:tblW w:w="0" w:type="auto"/>
+        <w:tblInd w:w="430" w:type="dxa"/>
+        <w:tblBorders>
+          <w:top w:val="single" w:sz="4" w:space="0" w:color="auto"/>
+          <w:left w:val="single" w:sz="4" w:space="0" w:color="auto"/>
+          <w:bottom w:val="single" w:sz="4" w:space="0" w:color="auto"/>
+          <w:insideH w:val="single" w:sz="4" w:space="0" w:color="auto"/>
+        </w:tblBorders>
+        <w:tblCellMar>
+          <w:left w:w="70" w:type="dxa"/>
+          <w:right w:w="70" w:type="dxa"/>
+        </w:tblCellMar>
+        <w:tblLook w:val="0000" w:firstRow="0" w:lastRow="0" w:firstColumn="0" w:lastColumn="0" w:noHBand="0" w:noVBand="0"/>
+      </w:tblPr>
+      <w:tblGrid>
+        <w:gridCol w:w="2449"/>
+        <w:gridCol w:w="1786"/>
+        <w:gridCol w:w="1969"/>
+        <w:gridCol w:w="1860"/>
+      </w:tblGrid>
+      <w:tr>
+        <w:tc>
+          <w:tcPr>
+            <w:tcW w:w="2490" w:type="dxa"/>
+            <w:tcBorders>
+              <w:right w:val="double" w:sz="4" w:space="0" w:color="auto"/>
+            </w:tcBorders>
+            <w:shd w:val="clear" w:color="auto" w:fill="EAEAEA"/>
+            <w:tcMar>
+              <w:left w:w="40" w:type="dxa"/>
+              <w:bottom w:w="17" w:type="dxa"/>
+              <w:right w:w="40" w:type="dxa"/>
+            </w:tcMar>
+          </w:tcPr>
+          <w:p>
+            <w:pPr>
+              <w:pStyle w:val="guiazul"/>
+              <w:rPr>
+                <w:i w:val="0"/>
+                <w:iCs/>
+                <w:color w:val="auto"/>
+              </w:rPr>
+            </w:pPr>
+            <w:r>
+              <w:rPr>
+                <w:i w:val="0"/>
+                <w:iCs/>
+                <w:color w:val="auto"/>
+              </w:rPr>
+              <w:t>Número de requisito</w:t>
+            </w:r>
+          </w:p>
+        </w:tc>
+        <w:tc>
+          <w:tcPr>
+            <w:tcW w:w="5664" w:type="dxa"/>
+            <w:gridSpan w:val="3"/>
+            <w:tcBorders>
+              <w:left w:val="double" w:sz="4" w:space="0" w:color="auto"/>
+              <w:right w:val="single" w:sz="4" w:space="0" w:color="auto"/>
+            </w:tcBorders>
+            <w:tcMar>
+              <w:left w:w="40" w:type="dxa"/>
+              <w:bottom w:w="17" w:type="dxa"/>
+              <w:right w:w="40" w:type="dxa"/>
+            </w:tcMar>
+          </w:tcPr>
+          <w:p>
+            <w:pPr>
+              <w:pStyle w:val="Normalindentado1"/>
+              <w:ind w:left="0"/>
+            </w:pPr>
+            <w:r>
+              <w:fldChar w:fldCharType="begin"/>
+            </w:r>
+            <w:r>
+              <w:instrText xml:space="preserve"> MACROBUTTON </w:instrText>
+            </w:r>
+            <w:r>
+              <w:fldChar w:fldCharType="end"/>
+            </w:r>
+            <w:r>
+              <w:t xml:space="preserve">RF </w:t>
+            </w:r>
+            <w:r>
+              <w:t>3</w:t>
+            </w:r>
+          </w:p>
+        </w:tc>
+      </w:tr>
+      <w:tr>
+        <w:tc>
+          <w:tcPr>
+            <w:tcW w:w="2490" w:type="dxa"/>
+            <w:tcBorders>
+              <w:right w:val="double" w:sz="4" w:space="0" w:color="auto"/>
+            </w:tcBorders>
+            <w:shd w:val="clear" w:color="auto" w:fill="EAEAEA"/>
+            <w:tcMar>
+              <w:left w:w="40" w:type="dxa"/>
+              <w:bottom w:w="17" w:type="dxa"/>
+              <w:right w:w="40" w:type="dxa"/>
+            </w:tcMar>
+          </w:tcPr>
+          <w:p>
+            <w:pPr>
+              <w:pStyle w:val="guiazul"/>
+              <w:rPr>
+                <w:i w:val="0"/>
+                <w:iCs/>
+                <w:color w:val="auto"/>
+              </w:rPr>
+            </w:pPr>
+            <w:r>
+              <w:rPr>
+                <w:i w:val="0"/>
+                <w:iCs/>
+                <w:color w:val="auto"/>
+              </w:rPr>
+              <w:t>Nombre de requisito</w:t>
+            </w:r>
+          </w:p>
+        </w:tc>
+        <w:tc>
+          <w:tcPr>
+            <w:tcW w:w="5664" w:type="dxa"/>
+            <w:gridSpan w:val="3"/>
+            <w:tcBorders>
+              <w:left w:val="double" w:sz="4" w:space="0" w:color="auto"/>
+              <w:right w:val="single" w:sz="4" w:space="0" w:color="auto"/>
+            </w:tcBorders>
+            <w:tcMar>
+              <w:left w:w="40" w:type="dxa"/>
+              <w:bottom w:w="17" w:type="dxa"/>
+              <w:right w:w="40" w:type="dxa"/>
+            </w:tcMar>
+          </w:tcPr>
+          <w:p>
+            <w:pPr>
+              <w:pStyle w:val="Normalindentado1"/>
+              <w:ind w:left="0"/>
+            </w:pPr>
+            <w:r>
+              <w:t>Protección Analógica</w:t>
+            </w:r>
+          </w:p>
+        </w:tc>
+      </w:tr>
+      <w:tr>
+        <w:tc>
+          <w:tcPr>
+            <w:tcW w:w="2490" w:type="dxa"/>
+            <w:tcBorders>
+              <w:right w:val="double" w:sz="4" w:space="0" w:color="auto"/>
+            </w:tcBorders>
+            <w:shd w:val="clear" w:color="auto" w:fill="EAEAEA"/>
+            <w:tcMar>
+              <w:left w:w="40" w:type="dxa"/>
+              <w:bottom w:w="17" w:type="dxa"/>
+              <w:right w:w="40" w:type="dxa"/>
+            </w:tcMar>
+          </w:tcPr>
+          <w:p>
+            <w:pPr>
+              <w:pStyle w:val="guiazul"/>
+              <w:rPr>
+                <w:i w:val="0"/>
+                <w:iCs/>
+                <w:color w:val="auto"/>
+              </w:rPr>
+            </w:pPr>
+            <w:r>
+              <w:rPr>
+                <w:i w:val="0"/>
+                <w:iCs/>
+                <w:color w:val="auto"/>
+              </w:rPr>
+              <w:t>Tipo</w:t>
+            </w:r>
+          </w:p>
+        </w:tc>
+        <w:tc>
+          <w:tcPr>
+            <w:tcW w:w="1800" w:type="dxa"/>
+            <w:tcBorders>
+              <w:left w:val="double" w:sz="4" w:space="0" w:color="auto"/>
+            </w:tcBorders>
+            <w:tcMar>
+              <w:left w:w="40" w:type="dxa"/>
+              <w:bottom w:w="17" w:type="dxa"/>
+              <w:right w:w="40" w:type="dxa"/>
+            </w:tcMar>
+          </w:tcPr>
+          <w:p>
+            <w:pPr>
+              <w:pStyle w:val="Normalindentado1"/>
+              <w:ind w:left="0"/>
+            </w:pPr>
+            <w:r>
+              <w:fldChar w:fldCharType="begin">
+                <w:ffData>
+                  <w:name w:val=""/>
+                  <w:enabled/>
+                  <w:calcOnExit w:val="0"/>
+                  <w:checkBox>
+                    <w:sizeAuto/>
+                    <w:default w:val="0"/>
+                  </w:checkBox>
+                </w:ffData>
+              </w:fldChar>
+            </w:r>
+            <w:r>
+              <w:instrText xml:space="preserve"> FORMCHECKBOX </w:instrText>
+            </w:r>
+            <w:r>
+              <w:fldChar w:fldCharType="separate"/>
+            </w:r>
+            <w:r>
+              <w:fldChar w:fldCharType="end"/>
+            </w:r>
+            <w:r>
+              <w:t xml:space="preserve"> Requisito</w:t>
+            </w:r>
+          </w:p>
+        </w:tc>
+        <w:tc>
+          <w:tcPr>
+            <w:tcW w:w="3864" w:type="dxa"/>
+            <w:gridSpan w:val="2"/>
+            <w:tcBorders>
+              <w:right w:val="single" w:sz="4" w:space="0" w:color="auto"/>
+            </w:tcBorders>
+          </w:tcPr>
+          <w:p>
+            <w:pPr>
+              <w:pStyle w:val="Normalindentado1"/>
+              <w:ind w:left="0"/>
+            </w:pPr>
+            <w:r>
+              <w:fldChar w:fldCharType="begin">
+                <w:ffData>
+                  <w:name w:val=""/>
+                  <w:enabled/>
+                  <w:calcOnExit w:val="0"/>
+                  <w:checkBox>
+                    <w:sizeAuto/>
+                    <w:default w:val="1"/>
+                  </w:checkBox>
+                </w:ffData>
+              </w:fldChar>
+            </w:r>
+            <w:r>
+              <w:instrText xml:space="preserve"> FORMCHECKBOX </w:instrText>
+            </w:r>
+            <w:r>
+              <w:fldChar w:fldCharType="separate"/>
+            </w:r>
+            <w:r>
+              <w:fldChar w:fldCharType="end"/>
+            </w:r>
+            <w:r>
+              <w:t xml:space="preserve"> Restricción</w:t>
+            </w:r>
+          </w:p>
+        </w:tc>
+      </w:tr>
+      <w:tr>
+        <w:tc>
+          <w:tcPr>
+            <w:tcW w:w="2490" w:type="dxa"/>
+            <w:tcBorders>
+              <w:right w:val="double" w:sz="4" w:space="0" w:color="auto"/>
+            </w:tcBorders>
+            <w:shd w:val="clear" w:color="auto" w:fill="EAEAEA"/>
+            <w:tcMar>
+              <w:left w:w="40" w:type="dxa"/>
+              <w:bottom w:w="17" w:type="dxa"/>
+              <w:right w:w="40" w:type="dxa"/>
+            </w:tcMar>
+          </w:tcPr>
+          <w:p>
+            <w:pPr>
+              <w:pStyle w:val="guiazul"/>
+              <w:rPr>
+                <w:i w:val="0"/>
+                <w:iCs/>
+                <w:color w:val="auto"/>
+              </w:rPr>
+            </w:pPr>
+            <w:r>
+              <w:rPr>
+                <w:i w:val="0"/>
+                <w:iCs/>
+                <w:color w:val="auto"/>
+              </w:rPr>
+              <w:t>Fuente del requisito</w:t>
+            </w:r>
+          </w:p>
+        </w:tc>
+        <w:tc>
+          <w:tcPr>
+            <w:tcW w:w="5664" w:type="dxa"/>
+            <w:gridSpan w:val="3"/>
+            <w:tcBorders>
+              <w:left w:val="double" w:sz="4" w:space="0" w:color="auto"/>
+              <w:bottom w:val="single" w:sz="4" w:space="0" w:color="auto"/>
+              <w:right w:val="single" w:sz="4" w:space="0" w:color="auto"/>
+            </w:tcBorders>
+            <w:tcMar>
+              <w:left w:w="40" w:type="dxa"/>
+              <w:bottom w:w="17" w:type="dxa"/>
+              <w:right w:w="40" w:type="dxa"/>
+            </w:tcMar>
+          </w:tcPr>
+          <w:p>
+            <w:pPr>
+              <w:pStyle w:val="Normalindentado1"/>
+              <w:ind w:left="0"/>
+            </w:pPr>
+            <w:r>
+              <w:t>Diseño de Hardware</w:t>
+            </w:r>
+          </w:p>
+        </w:tc>
+      </w:tr>
+      <w:tr>
+        <w:tc>
+          <w:tcPr>
+            <w:tcW w:w="2490" w:type="dxa"/>
+            <w:tcBorders>
+              <w:right w:val="double" w:sz="4" w:space="0" w:color="auto"/>
+            </w:tcBorders>
+            <w:shd w:val="clear" w:color="auto" w:fill="EAEAEA"/>
+            <w:tcMar>
+              <w:left w:w="40" w:type="dxa"/>
+              <w:bottom w:w="17" w:type="dxa"/>
+              <w:right w:w="40" w:type="dxa"/>
+            </w:tcMar>
+          </w:tcPr>
+          <w:p>
+            <w:pPr>
+              <w:pStyle w:val="guiazul"/>
+              <w:rPr>
+                <w:i w:val="0"/>
+                <w:iCs/>
+                <w:color w:val="auto"/>
+              </w:rPr>
+            </w:pPr>
+            <w:r>
+              <w:rPr>
+                <w:i w:val="0"/>
+                <w:iCs/>
+                <w:color w:val="auto"/>
+              </w:rPr>
+              <w:t>Prioridad del requisito</w:t>
+            </w:r>
+          </w:p>
+        </w:tc>
+        <w:tc>
+          <w:tcPr>
+            <w:tcW w:w="1800" w:type="dxa"/>
+            <w:tcBorders>
+              <w:left w:val="double" w:sz="4" w:space="0" w:color="auto"/>
+              <w:right w:val="nil"/>
+            </w:tcBorders>
+            <w:tcMar>
+              <w:left w:w="40" w:type="dxa"/>
+              <w:bottom w:w="17" w:type="dxa"/>
+              <w:right w:w="40" w:type="dxa"/>
+            </w:tcMar>
+          </w:tcPr>
+          <w:p>
+            <w:pPr>
+              <w:pStyle w:val="Normalindentado1"/>
+              <w:ind w:left="0"/>
+            </w:pPr>
+            <w:r>
+              <w:fldChar w:fldCharType="begin">
+                <w:ffData>
+                  <w:name w:val="Casilla3"/>
+                  <w:enabled/>
+                  <w:calcOnExit w:val="0"/>
+                  <w:checkBox>
+                    <w:sizeAuto/>
+                    <w:default w:val="1"/>
+                  </w:checkBox>
+                </w:ffData>
+              </w:fldChar>
+            </w:r>
+            <w:r>
+              <w:instrText xml:space="preserve"> FORMCHECKBOX </w:instrText>
+            </w:r>
+            <w:r>
+              <w:fldChar w:fldCharType="separate"/>
+            </w:r>
+            <w:r>
+              <w:fldChar w:fldCharType="end"/>
+            </w:r>
+            <w:r>
+              <w:t xml:space="preserve"> Alta/Esencial</w:t>
+            </w:r>
+          </w:p>
+        </w:tc>
+        <w:tc>
+          <w:tcPr>
+            <w:tcW w:w="1980" w:type="dxa"/>
+            <w:tcBorders>
+              <w:left w:val="nil"/>
+              <w:right w:val="nil"/>
+            </w:tcBorders>
+          </w:tcPr>
+          <w:p>
+            <w:pPr>
+              <w:pStyle w:val="Normalindentado1"/>
+              <w:ind w:left="0"/>
+            </w:pPr>
+            <w:r>
+              <w:fldChar w:fldCharType="begin">
+                <w:ffData>
+                  <w:name w:val="Casilla4"/>
+                  <w:enabled/>
+                  <w:calcOnExit w:val="0"/>
+                  <w:checkBox>
+                    <w:sizeAuto/>
+                    <w:default w:val="0"/>
+                  </w:checkBox>
+                </w:ffData>
+              </w:fldChar>
+            </w:r>
+            <w:r>
+              <w:instrText xml:space="preserve"> FORMCHECKBOX </w:instrText>
+            </w:r>
+            <w:r>
+              <w:fldChar w:fldCharType="separate"/>
+            </w:r>
+            <w:r>
+              <w:fldChar w:fldCharType="end"/>
+            </w:r>
+            <w:r>
+              <w:t xml:space="preserve"> Media/Deseado</w:t>
+            </w:r>
+          </w:p>
+        </w:tc>
+        <w:tc>
+          <w:tcPr>
+            <w:tcW w:w="1884" w:type="dxa"/>
+            <w:tcBorders>
+              <w:left w:val="nil"/>
+              <w:right w:val="single" w:sz="4" w:space="0" w:color="auto"/>
+            </w:tcBorders>
+          </w:tcPr>
+          <w:p>
+            <w:pPr>
+              <w:pStyle w:val="Normalindentado1"/>
+              <w:ind w:left="0"/>
+            </w:pPr>
+            <w:r>
+              <w:fldChar w:fldCharType="begin">
+                <w:ffData>
+                  <w:name w:val="Casilla5"/>
+                  <w:enabled/>
+                  <w:calcOnExit w:val="0"/>
+                  <w:checkBox>
+                    <w:sizeAuto/>
+                    <w:default w:val="0"/>
+                  </w:checkBox>
+                </w:ffData>
+              </w:fldChar>
+            </w:r>
+            <w:r>
+              <w:instrText xml:space="preserve"> FORMCHECKBOX </w:instrText>
+            </w:r>
+            <w:r>
+              <w:fldChar w:fldCharType="separate"/>
+            </w:r>
+            <w:r>
+              <w:fldChar w:fldCharType="end"/>
+            </w:r>
+            <w:r>
+              <w:t xml:space="preserve"> Baja/ Opcional</w:t>
+            </w:r>
+          </w:p>
+        </w:tc>
+      </w:tr>
+    </w:tbl>
     <w:p>
       <w:pPr>
         <w:pStyle w:val="guiazul"/>
         <w:ind w:left="360"/>
       </w:pPr>
-      <w:r>
-        <w:t>La distribución de los párrafos que forman este punto puede diferir del propuesto en esta plantilla, si las características del sistema aconsejan otra distribución para ofrecer mayor claridad en la exposición.</w:t>
-      </w:r>
+    </w:p>
+    <w:tbl>
+      <w:tblPr>
+        <w:tblW w:w="0" w:type="auto"/>
+        <w:tblInd w:w="430" w:type="dxa"/>
+        <w:tblBorders>
+          <w:top w:val="single" w:sz="4" w:space="0" w:color="auto"/>
+          <w:left w:val="single" w:sz="4" w:space="0" w:color="auto"/>
+          <w:bottom w:val="single" w:sz="4" w:space="0" w:color="auto"/>
+          <w:insideH w:val="single" w:sz="4" w:space="0" w:color="auto"/>
+        </w:tblBorders>
+        <w:tblCellMar>
+          <w:left w:w="70" w:type="dxa"/>
+          <w:right w:w="70" w:type="dxa"/>
+        </w:tblCellMar>
+        <w:tblLook w:val="0000" w:firstRow="0" w:lastRow="0" w:firstColumn="0" w:lastColumn="0" w:noHBand="0" w:noVBand="0"/>
+      </w:tblPr>
+      <w:tblGrid>
+        <w:gridCol w:w="2449"/>
+        <w:gridCol w:w="1786"/>
+        <w:gridCol w:w="1969"/>
+        <w:gridCol w:w="1860"/>
+      </w:tblGrid>
+      <w:tr>
+        <w:tc>
+          <w:tcPr>
+            <w:tcW w:w="2490" w:type="dxa"/>
+            <w:tcBorders>
+              <w:right w:val="double" w:sz="4" w:space="0" w:color="auto"/>
+            </w:tcBorders>
+            <w:shd w:val="clear" w:color="auto" w:fill="EAEAEA"/>
+            <w:tcMar>
+              <w:left w:w="40" w:type="dxa"/>
+              <w:bottom w:w="17" w:type="dxa"/>
+              <w:right w:w="40" w:type="dxa"/>
+            </w:tcMar>
+          </w:tcPr>
+          <w:p>
+            <w:pPr>
+              <w:pStyle w:val="guiazul"/>
+              <w:rPr>
+                <w:i w:val="0"/>
+                <w:iCs/>
+                <w:color w:val="auto"/>
+              </w:rPr>
+            </w:pPr>
+            <w:r>
+              <w:rPr>
+                <w:i w:val="0"/>
+                <w:iCs/>
+                <w:color w:val="auto"/>
+              </w:rPr>
+              <w:t>Número de requisito</w:t>
+            </w:r>
+          </w:p>
+        </w:tc>
+        <w:tc>
+          <w:tcPr>
+            <w:tcW w:w="5664" w:type="dxa"/>
+            <w:gridSpan w:val="3"/>
+            <w:tcBorders>
+              <w:left w:val="double" w:sz="4" w:space="0" w:color="auto"/>
+              <w:right w:val="single" w:sz="4" w:space="0" w:color="auto"/>
+            </w:tcBorders>
+            <w:tcMar>
+              <w:left w:w="40" w:type="dxa"/>
+              <w:bottom w:w="17" w:type="dxa"/>
+              <w:right w:w="40" w:type="dxa"/>
+            </w:tcMar>
+          </w:tcPr>
+          <w:p>
+            <w:pPr>
+              <w:pStyle w:val="Normalindentado1"/>
+              <w:ind w:left="0"/>
+            </w:pPr>
+            <w:r>
+              <w:fldChar w:fldCharType="begin"/>
+            </w:r>
+            <w:r>
+              <w:instrText xml:space="preserve"> MACROBUTTON </w:instrText>
+            </w:r>
+            <w:r>
+              <w:fldChar w:fldCharType="end"/>
+            </w:r>
+            <w:r>
+              <w:t xml:space="preserve">RF </w:t>
+            </w:r>
+            <w:r>
+              <w:t>4</w:t>
+            </w:r>
+          </w:p>
+        </w:tc>
+      </w:tr>
+      <w:tr>
+        <w:tc>
+          <w:tcPr>
+            <w:tcW w:w="2490" w:type="dxa"/>
+            <w:tcBorders>
+              <w:right w:val="double" w:sz="4" w:space="0" w:color="auto"/>
+            </w:tcBorders>
+            <w:shd w:val="clear" w:color="auto" w:fill="EAEAEA"/>
+            <w:tcMar>
+              <w:left w:w="40" w:type="dxa"/>
+              <w:bottom w:w="17" w:type="dxa"/>
+              <w:right w:w="40" w:type="dxa"/>
+            </w:tcMar>
+          </w:tcPr>
+          <w:p>
+            <w:pPr>
+              <w:pStyle w:val="guiazul"/>
+              <w:rPr>
+                <w:i w:val="0"/>
+                <w:iCs/>
+                <w:color w:val="auto"/>
+              </w:rPr>
+            </w:pPr>
+            <w:r>
+              <w:rPr>
+                <w:i w:val="0"/>
+                <w:iCs/>
+                <w:color w:val="auto"/>
+              </w:rPr>
+              <w:t>Nombre de requisito</w:t>
+            </w:r>
+          </w:p>
+        </w:tc>
+        <w:tc>
+          <w:tcPr>
+            <w:tcW w:w="5664" w:type="dxa"/>
+            <w:gridSpan w:val="3"/>
+            <w:tcBorders>
+              <w:left w:val="double" w:sz="4" w:space="0" w:color="auto"/>
+              <w:right w:val="single" w:sz="4" w:space="0" w:color="auto"/>
+            </w:tcBorders>
+            <w:tcMar>
+              <w:left w:w="40" w:type="dxa"/>
+              <w:bottom w:w="17" w:type="dxa"/>
+              <w:right w:w="40" w:type="dxa"/>
+            </w:tcMar>
+          </w:tcPr>
+          <w:p>
+            <w:pPr>
+              <w:pStyle w:val="Normalindentado1"/>
+              <w:ind w:left="0"/>
+            </w:pPr>
+            <w:r>
+              <w:t>Conducción con Protección Inductiva</w:t>
+            </w:r>
+          </w:p>
+        </w:tc>
+      </w:tr>
+      <w:tr>
+        <w:tc>
+          <w:tcPr>
+            <w:tcW w:w="2490" w:type="dxa"/>
+            <w:tcBorders>
+              <w:right w:val="double" w:sz="4" w:space="0" w:color="auto"/>
+            </w:tcBorders>
+            <w:shd w:val="clear" w:color="auto" w:fill="EAEAEA"/>
+            <w:tcMar>
+              <w:left w:w="40" w:type="dxa"/>
+              <w:bottom w:w="17" w:type="dxa"/>
+              <w:right w:w="40" w:type="dxa"/>
+            </w:tcMar>
+          </w:tcPr>
+          <w:p>
+            <w:pPr>
+              <w:pStyle w:val="guiazul"/>
+              <w:rPr>
+                <w:i w:val="0"/>
+                <w:iCs/>
+                <w:color w:val="auto"/>
+              </w:rPr>
+            </w:pPr>
+            <w:r>
+              <w:rPr>
+                <w:i w:val="0"/>
+                <w:iCs/>
+                <w:color w:val="auto"/>
+              </w:rPr>
+              <w:t>Tipo</w:t>
+            </w:r>
+          </w:p>
+        </w:tc>
+        <w:tc>
+          <w:tcPr>
+            <w:tcW w:w="1800" w:type="dxa"/>
+            <w:tcBorders>
+              <w:left w:val="double" w:sz="4" w:space="0" w:color="auto"/>
+            </w:tcBorders>
+            <w:tcMar>
+              <w:left w:w="40" w:type="dxa"/>
+              <w:bottom w:w="17" w:type="dxa"/>
+              <w:right w:w="40" w:type="dxa"/>
+            </w:tcMar>
+          </w:tcPr>
+          <w:p>
+            <w:pPr>
+              <w:pStyle w:val="Normalindentado1"/>
+              <w:ind w:left="0"/>
+            </w:pPr>
+            <w:r>
+              <w:fldChar w:fldCharType="begin">
+                <w:ffData>
+                  <w:name w:val=""/>
+                  <w:enabled/>
+                  <w:calcOnExit w:val="0"/>
+                  <w:checkBox>
+                    <w:sizeAuto/>
+                    <w:default w:val="0"/>
+                  </w:checkBox>
+                </w:ffData>
+              </w:fldChar>
+            </w:r>
+            <w:r>
+              <w:instrText xml:space="preserve"> FORMCHECKBOX </w:instrText>
+            </w:r>
+            <w:r>
+              <w:fldChar w:fldCharType="separate"/>
+            </w:r>
+            <w:r>
+              <w:fldChar w:fldCharType="end"/>
+            </w:r>
+            <w:r>
+              <w:t xml:space="preserve"> Requisito</w:t>
+            </w:r>
+          </w:p>
+        </w:tc>
+        <w:tc>
+          <w:tcPr>
+            <w:tcW w:w="3864" w:type="dxa"/>
+            <w:gridSpan w:val="2"/>
+            <w:tcBorders>
+              <w:right w:val="single" w:sz="4" w:space="0" w:color="auto"/>
+            </w:tcBorders>
+          </w:tcPr>
+          <w:p>
+            <w:pPr>
+              <w:pStyle w:val="Normalindentado1"/>
+              <w:ind w:left="0"/>
+            </w:pPr>
+            <w:r>
+              <w:fldChar w:fldCharType="begin">
+                <w:ffData>
+                  <w:name w:val=""/>
+                  <w:enabled/>
+                  <w:calcOnExit w:val="0"/>
+                  <w:checkBox>
+                    <w:sizeAuto/>
+                    <w:default w:val="1"/>
+                  </w:checkBox>
+                </w:ffData>
+              </w:fldChar>
+            </w:r>
+            <w:r>
+              <w:instrText xml:space="preserve"> FORMCHECKBOX </w:instrText>
+            </w:r>
+            <w:r>
+              <w:fldChar w:fldCharType="separate"/>
+            </w:r>
+            <w:r>
+              <w:fldChar w:fldCharType="end"/>
+            </w:r>
+            <w:r>
+              <w:t xml:space="preserve"> Restricción</w:t>
+            </w:r>
+          </w:p>
+        </w:tc>
+      </w:tr>
+      <w:tr>
+        <w:tc>
+          <w:tcPr>
+            <w:tcW w:w="2490" w:type="dxa"/>
+            <w:tcBorders>
+              <w:right w:val="double" w:sz="4" w:space="0" w:color="auto"/>
+            </w:tcBorders>
+            <w:shd w:val="clear" w:color="auto" w:fill="EAEAEA"/>
+            <w:tcMar>
+              <w:left w:w="40" w:type="dxa"/>
+              <w:bottom w:w="17" w:type="dxa"/>
+              <w:right w:w="40" w:type="dxa"/>
+            </w:tcMar>
+          </w:tcPr>
+          <w:p>
+            <w:pPr>
+              <w:pStyle w:val="guiazul"/>
+              <w:rPr>
+                <w:i w:val="0"/>
+                <w:iCs/>
+                <w:color w:val="auto"/>
+              </w:rPr>
+            </w:pPr>
+            <w:r>
+              <w:rPr>
+                <w:i w:val="0"/>
+                <w:iCs/>
+                <w:color w:val="auto"/>
+              </w:rPr>
+              <w:t>Fuente del requisito</w:t>
+            </w:r>
+          </w:p>
+        </w:tc>
+        <w:tc>
+          <w:tcPr>
+            <w:tcW w:w="5664" w:type="dxa"/>
+            <w:gridSpan w:val="3"/>
+            <w:tcBorders>
+              <w:left w:val="double" w:sz="4" w:space="0" w:color="auto"/>
+              <w:bottom w:val="single" w:sz="4" w:space="0" w:color="auto"/>
+              <w:right w:val="single" w:sz="4" w:space="0" w:color="auto"/>
+            </w:tcBorders>
+            <w:tcMar>
+              <w:left w:w="40" w:type="dxa"/>
+              <w:bottom w:w="17" w:type="dxa"/>
+              <w:right w:w="40" w:type="dxa"/>
+            </w:tcMar>
+          </w:tcPr>
+          <w:p>
+            <w:pPr>
+              <w:pStyle w:val="Normalindentado1"/>
+              <w:ind w:left="0"/>
+            </w:pPr>
+            <w:r>
+              <w:t>Diseño de Hardware</w:t>
+            </w:r>
+          </w:p>
+        </w:tc>
+      </w:tr>
+      <w:tr>
+        <w:tc>
+          <w:tcPr>
+            <w:tcW w:w="2490" w:type="dxa"/>
+            <w:tcBorders>
+              <w:right w:val="double" w:sz="4" w:space="0" w:color="auto"/>
+            </w:tcBorders>
+            <w:shd w:val="clear" w:color="auto" w:fill="EAEAEA"/>
+            <w:tcMar>
+              <w:left w:w="40" w:type="dxa"/>
+              <w:bottom w:w="17" w:type="dxa"/>
+              <w:right w:w="40" w:type="dxa"/>
+            </w:tcMar>
+          </w:tcPr>
+          <w:p>
+            <w:pPr>
+              <w:pStyle w:val="guiazul"/>
+              <w:rPr>
+                <w:i w:val="0"/>
+                <w:iCs/>
+                <w:color w:val="auto"/>
+              </w:rPr>
+            </w:pPr>
+            <w:r>
+              <w:rPr>
+                <w:i w:val="0"/>
+                <w:iCs/>
+                <w:color w:val="auto"/>
+              </w:rPr>
+              <w:t>Prioridad del requisito</w:t>
+            </w:r>
+          </w:p>
+        </w:tc>
+        <w:tc>
+          <w:tcPr>
+            <w:tcW w:w="1800" w:type="dxa"/>
+            <w:tcBorders>
+              <w:left w:val="double" w:sz="4" w:space="0" w:color="auto"/>
+              <w:right w:val="nil"/>
+            </w:tcBorders>
+            <w:tcMar>
+              <w:left w:w="40" w:type="dxa"/>
+              <w:bottom w:w="17" w:type="dxa"/>
+              <w:right w:w="40" w:type="dxa"/>
+            </w:tcMar>
+          </w:tcPr>
+          <w:p>
+            <w:pPr>
+              <w:pStyle w:val="Normalindentado1"/>
+              <w:ind w:left="0"/>
+            </w:pPr>
+            <w:r>
+              <w:fldChar w:fldCharType="begin">
+                <w:ffData>
+                  <w:name w:val=""/>
+                  <w:enabled/>
+                  <w:calcOnExit w:val="0"/>
+                  <w:checkBox>
+                    <w:sizeAuto/>
+                    <w:default w:val="0"/>
+                  </w:checkBox>
+                </w:ffData>
+              </w:fldChar>
+            </w:r>
+            <w:r>
+              <w:instrText xml:space="preserve"> FORMCHECKBOX </w:instrText>
+            </w:r>
+            <w:r>
+              <w:fldChar w:fldCharType="separate"/>
+            </w:r>
+            <w:r>
+              <w:fldChar w:fldCharType="end"/>
+            </w:r>
+            <w:r>
+              <w:t xml:space="preserve"> Alta/Esencial</w:t>
+            </w:r>
+          </w:p>
+        </w:tc>
+        <w:tc>
+          <w:tcPr>
+            <w:tcW w:w="1980" w:type="dxa"/>
+            <w:tcBorders>
+              <w:left w:val="nil"/>
+              <w:right w:val="nil"/>
+            </w:tcBorders>
+          </w:tcPr>
+          <w:p>
+            <w:pPr>
+              <w:pStyle w:val="Normalindentado1"/>
+              <w:ind w:left="0"/>
+            </w:pPr>
+            <w:r>
+              <w:fldChar w:fldCharType="begin">
+                <w:ffData>
+                  <w:name w:val=""/>
+                  <w:enabled/>
+                  <w:calcOnExit w:val="0"/>
+                  <w:checkBox>
+                    <w:sizeAuto/>
+                    <w:default w:val="1"/>
+                  </w:checkBox>
+                </w:ffData>
+              </w:fldChar>
+            </w:r>
+            <w:r>
+              <w:instrText xml:space="preserve"> FORMCHECKBOX </w:instrText>
+            </w:r>
+            <w:r>
+              <w:fldChar w:fldCharType="separate"/>
+            </w:r>
+            <w:r>
+              <w:fldChar w:fldCharType="end"/>
+            </w:r>
+            <w:r>
+              <w:t xml:space="preserve"> Media/Deseado</w:t>
+            </w:r>
+          </w:p>
+        </w:tc>
+        <w:tc>
+          <w:tcPr>
+            <w:tcW w:w="1884" w:type="dxa"/>
+            <w:tcBorders>
+              <w:left w:val="nil"/>
+              <w:right w:val="single" w:sz="4" w:space="0" w:color="auto"/>
+            </w:tcBorders>
+          </w:tcPr>
+          <w:p>
+            <w:pPr>
+              <w:pStyle w:val="Normalindentado1"/>
+              <w:ind w:left="0"/>
+            </w:pPr>
+            <w:r>
+              <w:fldChar w:fldCharType="begin">
+                <w:ffData>
+                  <w:name w:val="Casilla5"/>
+                  <w:enabled/>
+                  <w:calcOnExit w:val="0"/>
+                  <w:checkBox>
+                    <w:sizeAuto/>
+                    <w:default w:val="0"/>
+                  </w:checkBox>
+                </w:ffData>
+              </w:fldChar>
+            </w:r>
+            <w:r>
+              <w:instrText xml:space="preserve"> FORMCHECKBOX </w:instrText>
+            </w:r>
+            <w:r>
+              <w:fldChar w:fldCharType="separate"/>
+            </w:r>
+            <w:r>
+              <w:fldChar w:fldCharType="end"/>
+            </w:r>
+            <w:r>
+              <w:t xml:space="preserve"> Baja/ Opcional</w:t>
+            </w:r>
+          </w:p>
+        </w:tc>
+      </w:tr>
+    </w:tbl>
+    <w:p>
+      <w:pPr>
+        <w:pStyle w:val="guiazul"/>
+        <w:ind w:left="360"/>
+      </w:pPr>
     </w:p>
     <w:p>
       <w:pPr>
@@ -7348,7 +9406,6 @@
       </w:pPr>
       <w:bookmarkStart w:id="43" w:name="_Toc33411074"/>
       <w:r>
-        <w:lastRenderedPageBreak/>
         <w:t>Requisitos comunes de l</w:t>
       </w:r>
       <w:r>
@@ -7358,50 +9415,6 @@
         <w:t>s interfaces</w:t>
       </w:r>
       <w:bookmarkEnd w:id="43"/>
-    </w:p>
-    <w:p>
-      <w:pPr>
-        <w:pStyle w:val="Normalindentado2"/>
-      </w:pPr>
-      <w:r>
-        <w:fldChar w:fldCharType="begin"/>
-      </w:r>
-      <w:r>
-        <w:instrText>MACROBUTTON NoMacro [</w:instrText>
-      </w:r>
-      <w:r>
-        <w:rPr>
-          <w:color w:val="0000FF"/>
-        </w:rPr>
-        <w:instrText>Inserte aquí el texto</w:instrText>
-      </w:r>
-      <w:r>
-        <w:instrText>]</w:instrText>
-      </w:r>
-      <w:r>
-        <w:fldChar w:fldCharType="end"/>
-      </w:r>
-    </w:p>
-    <w:p>
-      <w:pPr>
-        <w:pStyle w:val="guiazul"/>
-        <w:ind w:firstLine="600"/>
-      </w:pPr>
-      <w:r>
-        <w:t>Descripción detallada de to</w:t>
-      </w:r>
-      <w:r>
-        <w:t>das la</w:t>
-      </w:r>
-      <w:r>
-        <w:t>s entradas y salidas del sistema de software</w:t>
-      </w:r>
-      <w:r>
-        <w:t xml:space="preserve"> y hardware</w:t>
-      </w:r>
-      <w:r>
-        <w:t>.</w:t>
-      </w:r>
     </w:p>
     <w:p>
       <w:pPr>
@@ -7424,7 +9437,23 @@
         </w:numPr>
       </w:pPr>
       <w:r>
-        <w:t>Indicadores Visuales Físicos: El dispositivo contará con una barra lineal de diodos LED de colores diferenciados: LEDs verdes para el estado activo de las entradas digitales, LEDs amarillos para indicar el estado de las salidas, y un LED rojo dedicado al estado del sistema (alimentación y error de ejecución del firmware).</w:t>
+        <w:t xml:space="preserve">Indicadores Visuales Físicos: El dispositivo contará con una barra lineal de diodos LED de colores diferenciados: </w:t>
+      </w:r>
+      <w:proofErr w:type="spellStart"/>
+      <w:r>
+        <w:t>LEDs</w:t>
+      </w:r>
+      <w:proofErr w:type="spellEnd"/>
+      <w:r>
+        <w:t xml:space="preserve"> verdes para el estado activo de las entradas digitales, </w:t>
+      </w:r>
+      <w:proofErr w:type="spellStart"/>
+      <w:r>
+        <w:t>LEDs</w:t>
+      </w:r>
+      <w:proofErr w:type="spellEnd"/>
+      <w:r>
+        <w:t xml:space="preserve"> amarillos para indicar el estado de las salidas, y un LED rojo dedicado al estado del sistema (alimentación y error de ejecución del firmware).</w:t>
       </w:r>
     </w:p>
     <w:p>
@@ -7450,6 +9479,7 @@
       </w:pPr>
       <w:bookmarkStart w:id="46" w:name="_Toc33411076"/>
       <w:r>
+        <w:lastRenderedPageBreak/>
         <w:t>Interfaces de hardware</w:t>
       </w:r>
       <w:bookmarkEnd w:id="46"/>
@@ -7480,7 +9510,15 @@
         </w:numPr>
       </w:pPr>
       <w:r>
-        <w:t>Entradas Múltiples: Disposición de canales digitales optoacoplados (compatibles con lógica de 5V y 24V) y canales analógicos con protección por diodos Zener limitadores para rangos de lectura de 0-5V DC.</w:t>
+        <w:t xml:space="preserve">Entradas Múltiples: Disposición de canales digitales </w:t>
+      </w:r>
+      <w:proofErr w:type="spellStart"/>
+      <w:r>
+        <w:t>optoacoplados</w:t>
+      </w:r>
+      <w:proofErr w:type="spellEnd"/>
+      <w:r>
+        <w:t xml:space="preserve"> (compatibles con lógica de 5V y 24V) y canales analógicos con protección por diodos Zener limitadores para rangos de lectura de 0-5V DC.</w:t>
       </w:r>
     </w:p>
     <w:p>
@@ -7527,23 +9565,159 @@
           <w:lang w:val="fr-FR"/>
         </w:rPr>
       </w:pPr>
+      <w:proofErr w:type="spellStart"/>
       <w:r>
         <w:rPr>
           <w:lang w:val="fr-FR"/>
         </w:rPr>
-        <w:t>Conexión USB-</w:t>
-      </w:r>
+        <w:t>Conexión</w:t>
+      </w:r>
+      <w:proofErr w:type="spellEnd"/>
       <w:r>
         <w:rPr>
           <w:lang w:val="fr-FR"/>
         </w:rPr>
-        <w:t>Serial :</w:t>
-      </w:r>
+        <w:t xml:space="preserve"> USB-Serial : Uso de un chip </w:t>
+      </w:r>
+      <w:proofErr w:type="spellStart"/>
       <w:r>
         <w:rPr>
           <w:lang w:val="fr-FR"/>
         </w:rPr>
-        <w:t xml:space="preserve"> Uso de un chip convertidor integrado en placa (como el CH340 o CP2102) para comunicar el microcontrolador con la computadora mediante un cable USB estándar.</w:t>
+        <w:t>convertidor</w:t>
+      </w:r>
+      <w:proofErr w:type="spellEnd"/>
+      <w:r>
+        <w:rPr>
+          <w:lang w:val="fr-FR"/>
+        </w:rPr>
+        <w:t xml:space="preserve"> </w:t>
+      </w:r>
+      <w:proofErr w:type="spellStart"/>
+      <w:r>
+        <w:rPr>
+          <w:lang w:val="fr-FR"/>
+        </w:rPr>
+        <w:t>integrado</w:t>
+      </w:r>
+      <w:proofErr w:type="spellEnd"/>
+      <w:r>
+        <w:rPr>
+          <w:lang w:val="fr-FR"/>
+        </w:rPr>
+        <w:t xml:space="preserve"> en </w:t>
+      </w:r>
+      <w:proofErr w:type="spellStart"/>
+      <w:r>
+        <w:rPr>
+          <w:lang w:val="fr-FR"/>
+        </w:rPr>
+        <w:t>placa</w:t>
+      </w:r>
+      <w:proofErr w:type="spellEnd"/>
+      <w:r>
+        <w:rPr>
+          <w:lang w:val="fr-FR"/>
+        </w:rPr>
+        <w:t xml:space="preserve"> (</w:t>
+      </w:r>
+      <w:proofErr w:type="spellStart"/>
+      <w:r>
+        <w:rPr>
+          <w:lang w:val="fr-FR"/>
+        </w:rPr>
+        <w:t>como</w:t>
+      </w:r>
+      <w:proofErr w:type="spellEnd"/>
+      <w:r>
+        <w:rPr>
+          <w:lang w:val="fr-FR"/>
+        </w:rPr>
+        <w:t xml:space="preserve"> el CH340 o CP2102) para </w:t>
+      </w:r>
+      <w:proofErr w:type="spellStart"/>
+      <w:r>
+        <w:rPr>
+          <w:lang w:val="fr-FR"/>
+        </w:rPr>
+        <w:t>comunicar</w:t>
+      </w:r>
+      <w:proofErr w:type="spellEnd"/>
+      <w:r>
+        <w:rPr>
+          <w:lang w:val="fr-FR"/>
+        </w:rPr>
+        <w:t xml:space="preserve"> el </w:t>
+      </w:r>
+      <w:proofErr w:type="spellStart"/>
+      <w:r>
+        <w:rPr>
+          <w:lang w:val="fr-FR"/>
+        </w:rPr>
+        <w:t>microcontrolador</w:t>
+      </w:r>
+      <w:proofErr w:type="spellEnd"/>
+      <w:r>
+        <w:rPr>
+          <w:lang w:val="fr-FR"/>
+        </w:rPr>
+        <w:t xml:space="preserve"> con la </w:t>
+      </w:r>
+      <w:proofErr w:type="spellStart"/>
+      <w:r>
+        <w:rPr>
+          <w:lang w:val="fr-FR"/>
+        </w:rPr>
+        <w:t>computadora</w:t>
+      </w:r>
+      <w:proofErr w:type="spellEnd"/>
+      <w:r>
+        <w:rPr>
+          <w:lang w:val="fr-FR"/>
+        </w:rPr>
+        <w:t xml:space="preserve"> </w:t>
+      </w:r>
+      <w:proofErr w:type="spellStart"/>
+      <w:r>
+        <w:rPr>
+          <w:lang w:val="fr-FR"/>
+        </w:rPr>
+        <w:t>mediante</w:t>
+      </w:r>
+      <w:proofErr w:type="spellEnd"/>
+      <w:r>
+        <w:rPr>
+          <w:lang w:val="fr-FR"/>
+        </w:rPr>
+        <w:t xml:space="preserve"> un </w:t>
+      </w:r>
+      <w:proofErr w:type="spellStart"/>
+      <w:r>
+        <w:rPr>
+          <w:lang w:val="fr-FR"/>
+        </w:rPr>
+        <w:t>cable</w:t>
+      </w:r>
+      <w:proofErr w:type="spellEnd"/>
+      <w:r>
+        <w:rPr>
+          <w:lang w:val="fr-FR"/>
+        </w:rPr>
+        <w:t xml:space="preserve"> USB </w:t>
+      </w:r>
+      <w:proofErr w:type="spellStart"/>
+      <w:r>
+        <w:rPr>
+          <w:lang w:val="fr-FR"/>
+        </w:rPr>
+        <w:t>estándar</w:t>
+      </w:r>
+      <w:proofErr w:type="spellEnd"/>
+      <w:r>
+        <w:rPr>
+          <w:lang w:val="fr-FR"/>
+        </w:rPr>
+        <w:t>.</w:t>
       </w:r>
     </w:p>
     <w:p>
@@ -7565,11 +9739,229 @@
           <w:lang w:val="fr-FR"/>
         </w:rPr>
       </w:pPr>
+      <w:proofErr w:type="spellStart"/>
       <w:r>
         <w:rPr>
           <w:lang w:val="fr-FR"/>
         </w:rPr>
-        <w:t>Estructura de Drivers Embebidos: Suministro de una biblioteca de software escrita en C/C++ que abstraiga el mapeo directo de registros de hardware. El estudiante invocará funciones simplificadas como leerEntradaDigital(1) o escribirSalida(2, HIGH).</w:t>
+        <w:t>Estructura</w:t>
+      </w:r>
+      <w:proofErr w:type="spellEnd"/>
+      <w:r>
+        <w:rPr>
+          <w:lang w:val="fr-FR"/>
+        </w:rPr>
+        <w:t xml:space="preserve"> de Drivers </w:t>
+      </w:r>
+      <w:proofErr w:type="spellStart"/>
+      <w:r>
+        <w:rPr>
+          <w:lang w:val="fr-FR"/>
+        </w:rPr>
+        <w:t>Embebidos</w:t>
+      </w:r>
+      <w:proofErr w:type="spellEnd"/>
+      <w:r>
+        <w:rPr>
+          <w:lang w:val="fr-FR"/>
+        </w:rPr>
+        <w:t xml:space="preserve">: </w:t>
+      </w:r>
+      <w:proofErr w:type="spellStart"/>
+      <w:r>
+        <w:rPr>
+          <w:lang w:val="fr-FR"/>
+        </w:rPr>
+        <w:t>Suministro</w:t>
+      </w:r>
+      <w:proofErr w:type="spellEnd"/>
+      <w:r>
+        <w:rPr>
+          <w:lang w:val="fr-FR"/>
+        </w:rPr>
+        <w:t xml:space="preserve"> de </w:t>
+      </w:r>
+      <w:proofErr w:type="spellStart"/>
+      <w:r>
+        <w:rPr>
+          <w:lang w:val="fr-FR"/>
+        </w:rPr>
+        <w:t>una</w:t>
+      </w:r>
+      <w:proofErr w:type="spellEnd"/>
+      <w:r>
+        <w:rPr>
+          <w:lang w:val="fr-FR"/>
+        </w:rPr>
+        <w:t xml:space="preserve"> </w:t>
+      </w:r>
+      <w:proofErr w:type="spellStart"/>
+      <w:r>
+        <w:rPr>
+          <w:lang w:val="fr-FR"/>
+        </w:rPr>
+        <w:t>biblioteca</w:t>
+      </w:r>
+      <w:proofErr w:type="spellEnd"/>
+      <w:r>
+        <w:rPr>
+          <w:lang w:val="fr-FR"/>
+        </w:rPr>
+        <w:t xml:space="preserve"> de software </w:t>
+      </w:r>
+      <w:proofErr w:type="spellStart"/>
+      <w:r>
+        <w:rPr>
+          <w:lang w:val="fr-FR"/>
+        </w:rPr>
+        <w:t>escrita</w:t>
+      </w:r>
+      <w:proofErr w:type="spellEnd"/>
+      <w:r>
+        <w:rPr>
+          <w:lang w:val="fr-FR"/>
+        </w:rPr>
+        <w:t xml:space="preserve"> en C/C++ que </w:t>
+      </w:r>
+      <w:proofErr w:type="spellStart"/>
+      <w:r>
+        <w:rPr>
+          <w:lang w:val="fr-FR"/>
+        </w:rPr>
+        <w:t>abstraiga</w:t>
+      </w:r>
+      <w:proofErr w:type="spellEnd"/>
+      <w:r>
+        <w:rPr>
+          <w:lang w:val="fr-FR"/>
+        </w:rPr>
+        <w:t xml:space="preserve"> el </w:t>
+      </w:r>
+      <w:proofErr w:type="spellStart"/>
+      <w:r>
+        <w:rPr>
+          <w:lang w:val="fr-FR"/>
+        </w:rPr>
+        <w:t>mapeo</w:t>
+      </w:r>
+      <w:proofErr w:type="spellEnd"/>
+      <w:r>
+        <w:rPr>
+          <w:lang w:val="fr-FR"/>
+        </w:rPr>
+        <w:t xml:space="preserve"> directo de </w:t>
+      </w:r>
+      <w:proofErr w:type="spellStart"/>
+      <w:r>
+        <w:rPr>
+          <w:lang w:val="fr-FR"/>
+        </w:rPr>
+        <w:t>registros</w:t>
+      </w:r>
+      <w:proofErr w:type="spellEnd"/>
+      <w:r>
+        <w:rPr>
+          <w:lang w:val="fr-FR"/>
+        </w:rPr>
+        <w:t xml:space="preserve"> de hardware. El </w:t>
+      </w:r>
+      <w:proofErr w:type="spellStart"/>
+      <w:r>
+        <w:rPr>
+          <w:lang w:val="fr-FR"/>
+        </w:rPr>
+        <w:t>estudiante</w:t>
+      </w:r>
+      <w:proofErr w:type="spellEnd"/>
+      <w:r>
+        <w:rPr>
+          <w:lang w:val="fr-FR"/>
+        </w:rPr>
+        <w:t xml:space="preserve"> </w:t>
+      </w:r>
+      <w:proofErr w:type="spellStart"/>
+      <w:r>
+        <w:rPr>
+          <w:lang w:val="fr-FR"/>
+        </w:rPr>
+        <w:t>invocará</w:t>
+      </w:r>
+      <w:proofErr w:type="spellEnd"/>
+      <w:r>
+        <w:rPr>
+          <w:lang w:val="fr-FR"/>
+        </w:rPr>
+        <w:t xml:space="preserve"> </w:t>
+      </w:r>
+      <w:proofErr w:type="spellStart"/>
+      <w:r>
+        <w:rPr>
+          <w:lang w:val="fr-FR"/>
+        </w:rPr>
+        <w:t>funciones</w:t>
+      </w:r>
+      <w:proofErr w:type="spellEnd"/>
+      <w:r>
+        <w:rPr>
+          <w:lang w:val="fr-FR"/>
+        </w:rPr>
+        <w:t xml:space="preserve"> </w:t>
+      </w:r>
+      <w:proofErr w:type="spellStart"/>
+      <w:r>
+        <w:rPr>
+          <w:lang w:val="fr-FR"/>
+        </w:rPr>
+        <w:t>simplificadas</w:t>
+      </w:r>
+      <w:proofErr w:type="spellEnd"/>
+      <w:r>
+        <w:rPr>
+          <w:lang w:val="fr-FR"/>
+        </w:rPr>
+        <w:t xml:space="preserve"> </w:t>
+      </w:r>
+      <w:proofErr w:type="spellStart"/>
+      <w:r>
+        <w:rPr>
+          <w:lang w:val="fr-FR"/>
+        </w:rPr>
+        <w:t>como</w:t>
+      </w:r>
+      <w:proofErr w:type="spellEnd"/>
+      <w:r>
+        <w:rPr>
+          <w:lang w:val="fr-FR"/>
+        </w:rPr>
+        <w:t xml:space="preserve"> </w:t>
+      </w:r>
+      <w:proofErr w:type="spellStart"/>
+      <w:r>
+        <w:rPr>
+          <w:lang w:val="fr-FR"/>
+        </w:rPr>
+        <w:t>leerEntradaDigital</w:t>
+      </w:r>
+      <w:proofErr w:type="spellEnd"/>
+      <w:r>
+        <w:rPr>
+          <w:lang w:val="fr-FR"/>
+        </w:rPr>
+        <w:t xml:space="preserve">(1) o </w:t>
+      </w:r>
+      <w:proofErr w:type="spellStart"/>
+      <w:r>
+        <w:rPr>
+          <w:lang w:val="fr-FR"/>
+        </w:rPr>
+        <w:t>escribirSalida</w:t>
+      </w:r>
+      <w:proofErr w:type="spellEnd"/>
+      <w:r>
+        <w:rPr>
+          <w:lang w:val="fr-FR"/>
+        </w:rPr>
+        <w:t>(2, HIGH).</w:t>
       </w:r>
     </w:p>
     <w:p>
@@ -7633,7 +10025,6 @@
       <w:bookmarkStart w:id="49" w:name="_Toc33238252"/>
       <w:bookmarkStart w:id="50" w:name="_Toc33411079"/>
       <w:r>
-        <w:lastRenderedPageBreak/>
         <w:t>Requisitos funcionales</w:t>
       </w:r>
       <w:bookmarkEnd w:id="49"/>
@@ -7656,7 +10047,15 @@
         <w:pStyle w:val="Normalindentado3"/>
       </w:pPr>
       <w:r>
-        <w:t>El sistema debe ejecutar el firmware de control bajo una arquitectura de lazo cerrado infinito (Scan Cycle) que consta de tres etapas sucesivas: lectura de todas las entradas físicas y almacenamiento en memoria, ejecución de las ecuaciones lógicas programadas por el estudiante, y actualización simultánea de los pines de salida física. El tiempo total del ciclo de ejecución no debe superar los 10 milisegundos para garantizar determinismo en prácticas de control en tiempo real.</w:t>
+        <w:t xml:space="preserve">El sistema debe ejecutar el firmware de control bajo una arquitectura de lazo cerrado infinito (Scan </w:t>
+      </w:r>
+      <w:proofErr w:type="spellStart"/>
+      <w:r>
+        <w:t>Cycle</w:t>
+      </w:r>
+      <w:proofErr w:type="spellEnd"/>
+      <w:r>
+        <w:t>) que consta de tres etapas sucesivas: lectura de todas las entradas físicas y almacenamiento en memoria, ejecución de las ecuaciones lógicas programadas por el estudiante, y actualización simultánea de los pines de salida física. El tiempo total del ciclo de ejecución no debe superar los 10 milisegundos para garantizar determinismo en prácticas de control en tiempo real.</w:t>
       </w:r>
     </w:p>
     <w:p>
@@ -7674,7 +10073,11 @@
         <w:pStyle w:val="Normalindentado3"/>
       </w:pPr>
       <w:r>
-        <w:t>Cada canal de entrada digital integrado en la PCB debe contar con un circuito optoacoplador intermedio. Este componente debe separar eléctricamente la zona de bornas expuesta al usuario (voltajes externos de laboratorio de hasta 24V) de la zona del microcontrolador lógico (voltaje interno de operación de 5V o 3.3V). Si un alumno comete un error y aplica un sobrevoltaje accidental en las bornas de entrada, el daño debe confinarse exclusivamente al optoacoplador modular de bajo costo, salvaguardando la integridad del procesador principal del PLC.</w:t>
+        <w:t xml:space="preserve">Cada canal de entrada digital integrado en la PCB debe contar con un circuito optoacoplador intermedio. Este componente debe separar eléctricamente la zona de bornas expuesta al usuario (voltajes externos de laboratorio de hasta 24V) de la zona del microcontrolador lógico (voltaje interno de operación de 5V o 3.3V). Si un alumno comete un error y aplica un sobrevoltaje accidental en las bornas de </w:t>
+      </w:r>
+      <w:r>
+        <w:lastRenderedPageBreak/>
+        <w:t>entrada, el daño debe confinarse exclusivamente al optoacoplador modular de bajo costo, salvaguardando la integridad del procesador principal del PLC.</w:t>
       </w:r>
     </w:p>
     <w:p>
@@ -7689,60 +10092,138 @@
     </w:p>
     <w:p>
       <w:pPr>
+        <w:pStyle w:val="Normalindentado3"/>
+      </w:pPr>
+      <w:r>
+        <w:t>Los canales analógicos deben estar equipados con una red de protección basada en diodos Zener limitadores. Esto garantizará que las señales de entrada se mantengan en el rango estricto de 0-5V DC, protegiendo los conversores analógico-digitales (ADC) del microcontrolador contra picos de voltaje generados por el uso incorrecto de sensores industriales en el laboratorio.</w:t>
+      </w:r>
+    </w:p>
+    <w:p>
+      <w:pPr>
+        <w:pStyle w:val="Heading2"/>
+      </w:pPr>
+      <w:bookmarkStart w:id="55" w:name="_Toc33238257"/>
+      <w:bookmarkStart w:id="56" w:name="_Toc33411084"/>
+      <w:r>
+        <w:t>Requisitos no funcionales</w:t>
+      </w:r>
+      <w:bookmarkEnd w:id="55"/>
+      <w:bookmarkEnd w:id="56"/>
+    </w:p>
+    <w:p>
+      <w:pPr>
         <w:pStyle w:val="Heading3"/>
       </w:pPr>
-      <w:bookmarkStart w:id="55" w:name="_Toc33411083"/>
-      <w:r>
-        <w:t>Requisito funcional n</w:t>
-      </w:r>
-      <w:bookmarkEnd w:id="55"/>
-    </w:p>
-    <w:p>
-      <w:pPr>
-        <w:pStyle w:val="Heading2"/>
-      </w:pPr>
-      <w:bookmarkStart w:id="56" w:name="_Toc33238257"/>
-      <w:bookmarkStart w:id="57" w:name="_Toc33411084"/>
-      <w:r>
-        <w:t>Requisitos no funcionales</w:t>
-      </w:r>
-      <w:bookmarkEnd w:id="56"/>
+      <w:bookmarkStart w:id="57" w:name="_Toc33238258"/>
+      <w:bookmarkStart w:id="58" w:name="_Toc33411085"/>
+      <w:r>
+        <w:t>Requisitos de rendimiento</w:t>
+      </w:r>
       <w:bookmarkEnd w:id="57"/>
+      <w:bookmarkEnd w:id="58"/>
+    </w:p>
+    <w:p>
+      <w:pPr>
+        <w:pStyle w:val="Normalindentado3"/>
+      </w:pPr>
+      <w:r>
+        <w:t>El sistema debe completar las tres etapas del ciclo de ejecución (lectura, ejecución de ecuaciones lógicas y actualización de salidas) en un tiempo total que no supere los 10 milisegundos.</w:t>
+      </w:r>
+    </w:p>
+    <w:p>
+      <w:pPr>
+        <w:pStyle w:val="Normalindentado3"/>
+      </w:pPr>
+    </w:p>
+    <w:p>
+      <w:pPr>
+        <w:pStyle w:val="Normalindentado3"/>
+      </w:pPr>
+      <w:r>
+        <w:t>Las salidas de potencia deben ser capaces de conmutar los estados lógicos a la velocidad impuesta por el ciclo de escaneo sin presentar retrasos superiores a 1 milisegundo.</w:t>
+      </w:r>
+    </w:p>
+    <w:p>
+      <w:pPr>
+        <w:pStyle w:val="Normalindentado3"/>
+      </w:pPr>
+    </w:p>
+    <w:p>
+      <w:pPr>
+        <w:pStyle w:val="Normalindentado3"/>
+      </w:pPr>
+    </w:p>
+    <w:p>
+      <w:pPr>
+        <w:pStyle w:val="Normalindentado3"/>
+      </w:pPr>
     </w:p>
     <w:p>
       <w:pPr>
         <w:pStyle w:val="Heading3"/>
       </w:pPr>
-      <w:bookmarkStart w:id="58" w:name="_Toc33238258"/>
-      <w:bookmarkStart w:id="59" w:name="_Toc33411085"/>
-      <w:r>
-        <w:t>Requisitos de rendimiento</w:t>
-      </w:r>
-      <w:bookmarkEnd w:id="58"/>
+      <w:bookmarkStart w:id="59" w:name="_Toc33238259"/>
+      <w:bookmarkStart w:id="60" w:name="_Toc33411086"/>
+      <w:r>
+        <w:t>Seguridad</w:t>
+      </w:r>
       <w:bookmarkEnd w:id="59"/>
+      <w:bookmarkEnd w:id="60"/>
     </w:p>
     <w:p>
       <w:pPr>
         <w:pStyle w:val="Normalindentado3"/>
       </w:pPr>
       <w:r>
-        <w:fldChar w:fldCharType="begin"/>
-      </w:r>
-      <w:r>
-        <w:instrText>MACROBUTTON NoMacro [</w:instrText>
-      </w:r>
-      <w:r>
-        <w:rPr>
-          <w:color w:val="0000FF"/>
-        </w:rPr>
-        <w:instrText>Inserte aquí el texto</w:instrText>
-      </w:r>
-      <w:r>
-        <w:instrText>]</w:instrText>
-      </w:r>
-      <w:r>
-        <w:fldChar w:fldCharType="end"/>
-      </w:r>
+        <w:rPr>
+          <w:b/>
+          <w:bCs/>
+        </w:rPr>
+        <w:t>Seguridad Eléctrica:</w:t>
+      </w:r>
+      <w:r>
+        <w:t xml:space="preserve"> Las entradas de voltaje manipulables por los estudiantes no deben exceder niveles de baja tensión (máximo 24V DC).</w:t>
+      </w:r>
+    </w:p>
+    <w:p>
+      <w:pPr>
+        <w:pStyle w:val="Normalindentado3"/>
+      </w:pPr>
+    </w:p>
+    <w:p>
+      <w:pPr>
+        <w:pStyle w:val="Normalindentado3"/>
+      </w:pPr>
+      <w:r>
+        <w:rPr>
+          <w:b/>
+          <w:bCs/>
+        </w:rPr>
+        <w:t>Aislamiento:</w:t>
+      </w:r>
+      <w:r>
+        <w:t xml:space="preserve"> El núcleo del procesador debe estar protegido mediante aislamiento </w:t>
+      </w:r>
+      <w:proofErr w:type="spellStart"/>
+      <w:r>
+        <w:t>optoacoplado</w:t>
+      </w:r>
+      <w:proofErr w:type="spellEnd"/>
+      <w:r>
+        <w:t xml:space="preserve"> completo. Cualquier sobrevoltaje accidental debe confinar el daño exclusivamente al optoacoplador, salvaguardando el procesador principal.</w:t>
+      </w:r>
+    </w:p>
+    <w:p>
+      <w:pPr>
+        <w:pStyle w:val="Heading3"/>
+      </w:pPr>
+      <w:bookmarkStart w:id="61" w:name="_Toc33238260"/>
+      <w:bookmarkStart w:id="62" w:name="_Toc33411087"/>
+      <w:r>
+        <w:t>Fiabilidad</w:t>
+      </w:r>
+      <w:bookmarkEnd w:id="61"/>
+      <w:bookmarkEnd w:id="62"/>
     </w:p>
     <w:p>
       <w:pPr>
@@ -7750,7 +10231,11 @@
         <w:ind w:left="1200"/>
       </w:pPr>
       <w:r>
-        <w:t>Especificación de los requisitos relacionados con la carga que se espera tenga que soportar el sistema. Por ejemplo, el número de terminales, el número esperado de usuarios simultáneamente conectados, número de transacciones por segundo que deberá soportar el sistema, etc.</w:t>
+        <w:rPr>
+          <w:i w:val="0"/>
+          <w:color w:val="auto"/>
+        </w:rPr>
+        <w:t xml:space="preserve">El hardware debe ser capaz de operar de manera ininterrumpida y confiable en ambientes de taller hostiles, expuesto al polvo y sin requerir aire acondicionado industrial. </w:t>
       </w:r>
     </w:p>
     <w:p>
@@ -7758,532 +10243,218 @@
         <w:pStyle w:val="guiazul"/>
         <w:ind w:left="1200"/>
       </w:pPr>
-      <w:r>
-        <w:t>Todos estos requisitos deben ser mesurables. Por ejemplo, indicando “el 95% de las transacciones deben realizarse en menos de 1 segundo”, en lugar de “los operadores no deben esperar a que se complete la transacción”.</w:t>
-      </w:r>
-    </w:p>
-    <w:p>
-      <w:pPr>
-        <w:pStyle w:val="Heading3"/>
-      </w:pPr>
-      <w:bookmarkStart w:id="60" w:name="_Toc33238259"/>
-      <w:bookmarkStart w:id="61" w:name="_Toc33411086"/>
-      <w:r>
-        <w:t>Seguridad</w:t>
-      </w:r>
-      <w:bookmarkEnd w:id="60"/>
-      <w:bookmarkEnd w:id="61"/>
-    </w:p>
-    <w:p>
-      <w:pPr>
-        <w:pStyle w:val="Normalindentado3"/>
-      </w:pPr>
-      <w:r>
-        <w:fldChar w:fldCharType="begin"/>
-      </w:r>
-      <w:r>
-        <w:instrText>MACROBUTTON NoMacro [</w:instrText>
-      </w:r>
-      <w:r>
-        <w:rPr>
-          <w:color w:val="0000FF"/>
-        </w:rPr>
-        <w:instrText>Inserte aquí el texto</w:instrText>
-      </w:r>
-      <w:r>
-        <w:instrText>]</w:instrText>
-      </w:r>
-      <w:r>
-        <w:fldChar w:fldCharType="end"/>
-      </w:r>
     </w:p>
     <w:p>
       <w:pPr>
         <w:pStyle w:val="guiazul"/>
         <w:ind w:left="1200"/>
-      </w:pPr>
-      <w:r>
-        <w:t>Especificación de elementos que protegerán al software de accesos, usos y sabotajes maliciosos, así como de modificaciones o destrucciones maliciosas o accidentales. Los requisitos pueden especificar:</w:t>
+        <w:rPr>
+          <w:color w:val="000000" w:themeColor="text1"/>
+        </w:rPr>
+      </w:pPr>
+      <w:r>
+        <w:rPr>
+          <w:color w:val="000000" w:themeColor="text1"/>
+        </w:rPr>
+        <w:t>Las bornas de conexión deben soportar la manipulación ruda continua de los estudiantes utilizando cables desde calibre 14 hasta 22 AWG.</w:t>
+      </w:r>
+    </w:p>
+    <w:p>
+      <w:pPr>
+        <w:pStyle w:val="Heading3"/>
+      </w:pPr>
+      <w:bookmarkStart w:id="63" w:name="_Toc33238261"/>
+      <w:bookmarkStart w:id="64" w:name="_Toc33411088"/>
+      <w:r>
+        <w:t>Disponibilidad</w:t>
+      </w:r>
+      <w:bookmarkEnd w:id="63"/>
+      <w:bookmarkEnd w:id="64"/>
+    </w:p>
+    <w:p>
+      <w:pPr>
+        <w:pStyle w:val="Normalindentado3"/>
+      </w:pPr>
+      <w:r>
+        <w:t>El sistema debe ofrecer una disponibilidad del 99% durante el horario de prácticas de laboratorio, garantizando que el hardware responda inmediatamente tras ser energizado con las fuentes reguladas externas (5V, 12V o 24V DC).</w:t>
+      </w:r>
+    </w:p>
+    <w:p>
+      <w:pPr>
+        <w:pStyle w:val="Heading3"/>
+      </w:pPr>
+      <w:bookmarkStart w:id="65" w:name="_Toc33238262"/>
+      <w:bookmarkStart w:id="66" w:name="_Toc33411089"/>
+      <w:r>
+        <w:t>Mantenibilidad</w:t>
+      </w:r>
+      <w:bookmarkEnd w:id="65"/>
+      <w:bookmarkEnd w:id="66"/>
+    </w:p>
+    <w:p>
+      <w:pPr>
+        <w:pStyle w:val="Normalindentado3"/>
+      </w:pPr>
+      <w:r>
+        <w:t>El producto debe ser altamente mantenible. Al utilizar optoacopladores modulares de bajo costo, la sustitución de canales de entrada dañados debe poder realizarse por el personal técnico en un tiempo mínimo.</w:t>
+      </w:r>
+    </w:p>
+    <w:p>
+      <w:pPr>
+        <w:pStyle w:val="Normalindentado3"/>
+      </w:pPr>
+    </w:p>
+    <w:p>
+      <w:pPr>
+        <w:pStyle w:val="Normalindentado3"/>
+      </w:pPr>
+      <w:r>
+        <w:t>El uso de carcasas plásticas impresas en 3D permite la fabricación local y el reemplazo inmediato de piezas mecánicas rotas utilizando resina o filamento estándar.</w:t>
+      </w:r>
+    </w:p>
+    <w:p>
+      <w:pPr>
+        <w:pStyle w:val="Heading3"/>
+      </w:pPr>
+      <w:bookmarkStart w:id="67" w:name="_Toc33238263"/>
+      <w:bookmarkStart w:id="68" w:name="_Toc33411090"/>
+      <w:r>
+        <w:lastRenderedPageBreak/>
+        <w:t>Portabilidad</w:t>
+      </w:r>
+      <w:bookmarkEnd w:id="67"/>
+      <w:bookmarkEnd w:id="68"/>
+    </w:p>
+    <w:p>
+      <w:pPr>
+        <w:pStyle w:val="Normalindentado3"/>
+      </w:pPr>
+      <w:r>
+        <w:t xml:space="preserve">El código debe ser completamente programable mediante herramientas de código abierto o software libre (IDE de Arduino, </w:t>
+      </w:r>
+      <w:proofErr w:type="spellStart"/>
+      <w:r>
+        <w:t>PlatformIO</w:t>
+      </w:r>
+      <w:proofErr w:type="spellEnd"/>
+      <w:r>
+        <w:t>) en múltiples sistemas operativos, evitando el uso de licencias comerciales restrictivas.</w:t>
+      </w:r>
+    </w:p>
+    <w:p>
+      <w:pPr>
+        <w:pStyle w:val="Normalindentado3"/>
+      </w:pPr>
+    </w:p>
+    <w:p>
+      <w:pPr>
+        <w:pStyle w:val="Normalindentado3"/>
+      </w:pPr>
+      <w:r>
+        <w:t>El diseño debe contemplar la futura migración del firmware hacia un entorno compatible con la norma IEC 61131-3.</w:t>
+      </w:r>
+    </w:p>
+    <w:p>
+      <w:pPr>
+        <w:pStyle w:val="Heading2"/>
+      </w:pPr>
+      <w:bookmarkStart w:id="69" w:name="_Toc33411091"/>
+      <w:r>
+        <w:t>Otros requisitos</w:t>
+      </w:r>
+      <w:bookmarkEnd w:id="69"/>
+    </w:p>
+    <w:p>
+      <w:pPr>
+        <w:pStyle w:val="Heading3"/>
+      </w:pPr>
+      <w:bookmarkStart w:id="70" w:name="_Toc33238265"/>
+      <w:bookmarkStart w:id="71" w:name="_Toc33411092"/>
+      <w:r>
+        <w:t>Requisitos legales</w:t>
+      </w:r>
+    </w:p>
+    <w:p>
+      <w:pPr>
+        <w:pStyle w:val="Normalindentado3"/>
+      </w:pPr>
+      <w:r>
+        <w:t>El diseño de la placa (PCB) debe ceñirse a las normativas básicas de seguridad eléctrica para equipos didácticos de baja tensión (Directiva de Baja Tensión / RoHS para componentes libres de plomo).</w:t>
+      </w:r>
+    </w:p>
+    <w:p>
+      <w:pPr>
+        <w:pStyle w:val="Heading3"/>
+      </w:pPr>
+      <w:r>
+        <w:t>Requisitos culturales</w:t>
+      </w:r>
+    </w:p>
+    <w:p>
+      <w:pPr>
+        <w:pStyle w:val="Normalindentado3"/>
+      </w:pPr>
+      <w:r>
+        <w:t>La serigrafía del equipo debe ser intuitiva y numerada lógicamente (IN_01, OUT_01) para facilitar el aprendizaje visual de los estudiantes.</w:t>
+      </w:r>
+    </w:p>
+    <w:p>
+      <w:pPr>
+        <w:pStyle w:val="Heading3"/>
+      </w:pPr>
+      <w:r>
+        <w:t>Otros requisitos</w:t>
+      </w:r>
+    </w:p>
+    <w:p>
+      <w:pPr>
+        <w:pStyle w:val="Heading1"/>
+      </w:pPr>
+      <w:r>
+        <w:t>Apéndices</w:t>
+      </w:r>
+      <w:bookmarkEnd w:id="70"/>
+      <w:bookmarkEnd w:id="71"/>
+    </w:p>
+    <w:p>
+      <w:pPr>
+        <w:pStyle w:val="Normalindentado1"/>
+      </w:pPr>
+      <w:r>
+        <w:rPr>
+          <w:b/>
+          <w:bCs/>
+        </w:rPr>
+        <w:t>Apéndice A - Repositorio de Código:</w:t>
+      </w:r>
+      <w:r>
+        <w:t xml:space="preserve"> Toda la documentación técnica, esquemáticos en formato CAD y el firmware base se encuentran versionados y respaldados en el repositorio de GitHub asignado al proyecto.</w:t>
+      </w:r>
+    </w:p>
+    <w:p>
+      <w:pPr>
+        <w:pStyle w:val="Normalindentado1"/>
+      </w:pPr>
+    </w:p>
+    <w:p>
+      <w:pPr>
+        <w:pStyle w:val="Normalindentado1"/>
+      </w:pPr>
+      <w:r>
+        <w:rPr>
+          <w:b/>
+          <w:bCs/>
+        </w:rPr>
+        <w:t>Apéndice B - Módulos Futuros:</w:t>
+      </w:r>
+      <w:r>
+        <w:t xml:space="preserve"> Documentación preliminar sobre el diseño de tarjetas secundarias apilables (Shields) para expansión de conectividad inalámbrica o relés de mayor capacidad.</w:t>
       </w:r>
     </w:p>
     <w:p>
       <w:pPr>
         <w:pStyle w:val="guiazul"/>
-        <w:numPr>
-          <w:ilvl w:val="0"/>
-          <w:numId w:val="7"/>
-        </w:numPr>
-      </w:pPr>
-      <w:r>
-        <w:t>Empleo de técnicas criptográficas.</w:t>
-      </w:r>
-    </w:p>
-    <w:p>
-      <w:pPr>
-        <w:pStyle w:val="guiazul"/>
-        <w:numPr>
-          <w:ilvl w:val="0"/>
-          <w:numId w:val="7"/>
-        </w:numPr>
-      </w:pPr>
-      <w:r>
-        <w:t>Registro de ficheros con “logs” de actividad.</w:t>
-      </w:r>
-    </w:p>
-    <w:p>
-      <w:pPr>
-        <w:pStyle w:val="guiazul"/>
-        <w:numPr>
-          <w:ilvl w:val="0"/>
-          <w:numId w:val="7"/>
-        </w:numPr>
-      </w:pPr>
-      <w:r>
-        <w:t>Asignación de determinadas funcionalidades a determinados módulos.</w:t>
-      </w:r>
-    </w:p>
-    <w:p>
-      <w:pPr>
-        <w:pStyle w:val="guiazul"/>
-        <w:numPr>
-          <w:ilvl w:val="0"/>
-          <w:numId w:val="7"/>
-        </w:numPr>
-      </w:pPr>
-      <w:r>
-        <w:t>Restricciones de comunicación entre determinados módulos.</w:t>
-      </w:r>
-    </w:p>
-    <w:p>
-      <w:pPr>
-        <w:pStyle w:val="guiazul"/>
-        <w:numPr>
-          <w:ilvl w:val="0"/>
-          <w:numId w:val="7"/>
-        </w:numPr>
-      </w:pPr>
-      <w:r>
-        <w:t>Comprobaciones de integridad de información crítica.</w:t>
-      </w:r>
-    </w:p>
-    <w:p>
-      <w:pPr>
-        <w:pStyle w:val="Heading3"/>
-      </w:pPr>
-      <w:bookmarkStart w:id="62" w:name="_Toc33238260"/>
-      <w:bookmarkStart w:id="63" w:name="_Toc33411087"/>
-      <w:r>
-        <w:t>Fiabilidad</w:t>
-      </w:r>
-      <w:bookmarkEnd w:id="62"/>
-      <w:bookmarkEnd w:id="63"/>
-    </w:p>
-    <w:p>
-      <w:pPr>
-        <w:pStyle w:val="Normalindentado3"/>
-      </w:pPr>
-      <w:r>
-        <w:fldChar w:fldCharType="begin"/>
-      </w:r>
-      <w:r>
-        <w:instrText>MACROBUTTON NoMacro [</w:instrText>
-      </w:r>
-      <w:r>
-        <w:rPr>
-          <w:color w:val="0000FF"/>
-        </w:rPr>
-        <w:instrText>Inserte aquí el texto</w:instrText>
-      </w:r>
-      <w:r>
-        <w:instrText>]</w:instrText>
-      </w:r>
-      <w:r>
-        <w:fldChar w:fldCharType="end"/>
-      </w:r>
-    </w:p>
-    <w:p>
-      <w:pPr>
-        <w:pStyle w:val="guiazul"/>
-        <w:ind w:left="1200"/>
-      </w:pPr>
-      <w:r>
-        <w:t>Especificación de los factores de fiabilidad necesaria del sistema. Esto se expresa generalmente como el tiempo entre los incidentes permisibles, o el total de incidentes permisible.</w:t>
-      </w:r>
-    </w:p>
-    <w:p>
-      <w:pPr>
-        <w:pStyle w:val="Heading3"/>
-      </w:pPr>
-      <w:bookmarkStart w:id="64" w:name="_Toc33238261"/>
-      <w:bookmarkStart w:id="65" w:name="_Toc33411088"/>
-      <w:r>
-        <w:lastRenderedPageBreak/>
-        <w:t>Disponibilidad</w:t>
-      </w:r>
-      <w:bookmarkEnd w:id="64"/>
-      <w:bookmarkEnd w:id="65"/>
-    </w:p>
-    <w:p>
-      <w:pPr>
-        <w:pStyle w:val="Normalindentado3"/>
-      </w:pPr>
-      <w:r>
-        <w:fldChar w:fldCharType="begin"/>
-      </w:r>
-      <w:r>
-        <w:instrText>MACROBUTTON NoMacro [</w:instrText>
-      </w:r>
-      <w:r>
-        <w:rPr>
-          <w:color w:val="0000FF"/>
-        </w:rPr>
-        <w:instrText>Inserte aquí el texto</w:instrText>
-      </w:r>
-      <w:r>
-        <w:instrText>]</w:instrText>
-      </w:r>
-      <w:r>
-        <w:fldChar w:fldCharType="end"/>
-      </w:r>
-    </w:p>
-    <w:p>
-      <w:pPr>
-        <w:pStyle w:val="guiazul"/>
-        <w:ind w:left="1200"/>
-      </w:pPr>
-      <w:r>
-        <w:t>Especificación de los factores de disponibilidad final exigidos al sistema. Normalmente expresados en % de tiempo en los que el software tiene que mostrar disponibilidad.</w:t>
-      </w:r>
-    </w:p>
-    <w:p>
-      <w:pPr>
-        <w:pStyle w:val="Heading3"/>
-      </w:pPr>
-      <w:bookmarkStart w:id="66" w:name="_Toc33238262"/>
-      <w:bookmarkStart w:id="67" w:name="_Toc33411089"/>
-      <w:r>
-        <w:t>Mantenibilidad</w:t>
-      </w:r>
-      <w:bookmarkEnd w:id="66"/>
-      <w:bookmarkEnd w:id="67"/>
-    </w:p>
-    <w:p>
-      <w:pPr>
-        <w:pStyle w:val="Normalindentado3"/>
-      </w:pPr>
-      <w:r>
-        <w:fldChar w:fldCharType="begin"/>
-      </w:r>
-      <w:r>
-        <w:instrText>MACROBUTTON NoMacro [</w:instrText>
-      </w:r>
-      <w:r>
-        <w:rPr>
-          <w:color w:val="0000FF"/>
-        </w:rPr>
-        <w:instrText>Inserte aquí el texto</w:instrText>
-      </w:r>
-      <w:r>
-        <w:instrText>]</w:instrText>
-      </w:r>
-      <w:r>
-        <w:fldChar w:fldCharType="end"/>
-      </w:r>
-    </w:p>
-    <w:p>
-      <w:pPr>
-        <w:pStyle w:val="guiazul"/>
-        <w:ind w:left="1200"/>
-      </w:pPr>
-      <w:r>
-        <w:t xml:space="preserve">Identificación del tipo de mantenimiento necesario del sistema. </w:t>
-      </w:r>
-    </w:p>
-    <w:p>
-      <w:pPr>
-        <w:pStyle w:val="guiazul"/>
-        <w:ind w:left="1200"/>
-      </w:pPr>
-      <w:r>
-        <w:t>Especificación de quien debe realizar las tareas de mantenimiento, por ejemplo usuarios, o un desarrollador.</w:t>
-      </w:r>
-    </w:p>
-    <w:p>
-      <w:pPr>
-        <w:pStyle w:val="guiazul"/>
-        <w:ind w:left="1200"/>
-      </w:pPr>
-      <w:r>
-        <w:t>Especificación de cuando debe realizarse las tareas de mantenimiento. Por ejemplo, generación de estadísticas de acceso semanales y mensuales.</w:t>
-      </w:r>
-    </w:p>
-    <w:p>
-      <w:pPr>
-        <w:pStyle w:val="Heading3"/>
-      </w:pPr>
-      <w:bookmarkStart w:id="68" w:name="_Toc33238263"/>
-      <w:bookmarkStart w:id="69" w:name="_Toc33411090"/>
-      <w:r>
-        <w:t>Portabilidad</w:t>
-      </w:r>
-      <w:bookmarkEnd w:id="68"/>
-      <w:bookmarkEnd w:id="69"/>
-    </w:p>
-    <w:p>
-      <w:pPr>
-        <w:pStyle w:val="Normalindentado3"/>
-      </w:pPr>
-      <w:r>
-        <w:fldChar w:fldCharType="begin"/>
-      </w:r>
-      <w:r>
-        <w:instrText>MACROBUTTON NoMacro [</w:instrText>
-      </w:r>
-      <w:r>
-        <w:rPr>
-          <w:color w:val="0000FF"/>
-        </w:rPr>
-        <w:instrText>Inserte aquí el texto</w:instrText>
-      </w:r>
-      <w:r>
-        <w:instrText>]</w:instrText>
-      </w:r>
-      <w:r>
-        <w:fldChar w:fldCharType="end"/>
-      </w:r>
-    </w:p>
-    <w:p>
-      <w:pPr>
-        <w:pStyle w:val="guiazul"/>
-        <w:ind w:left="1200"/>
-      </w:pPr>
-      <w:r>
-        <w:t>Especificación de atributos que debe presentar el software para facilitar su traslado a otras plataformas u entornos. Pueden incluirse:</w:t>
-      </w:r>
-    </w:p>
-    <w:p>
-      <w:pPr>
-        <w:pStyle w:val="guiazul"/>
-        <w:numPr>
-          <w:ilvl w:val="0"/>
-          <w:numId w:val="8"/>
-        </w:numPr>
-      </w:pPr>
-      <w:r>
-        <w:t>Porcentaje de componentes dependientes del servidor.</w:t>
-      </w:r>
-    </w:p>
-    <w:p>
-      <w:pPr>
-        <w:pStyle w:val="guiazul"/>
-        <w:numPr>
-          <w:ilvl w:val="0"/>
-          <w:numId w:val="8"/>
-        </w:numPr>
-      </w:pPr>
-      <w:r>
-        <w:t>Porcentaje de código dependiente del servidor.</w:t>
-      </w:r>
-    </w:p>
-    <w:p>
-      <w:pPr>
-        <w:pStyle w:val="guiazul"/>
-        <w:numPr>
-          <w:ilvl w:val="0"/>
-          <w:numId w:val="8"/>
-        </w:numPr>
-      </w:pPr>
-      <w:r>
-        <w:t>Uso de un determinado lenguaje por su portabilidad.</w:t>
-      </w:r>
-    </w:p>
-    <w:p>
-      <w:pPr>
-        <w:pStyle w:val="guiazul"/>
-        <w:numPr>
-          <w:ilvl w:val="0"/>
-          <w:numId w:val="8"/>
-        </w:numPr>
-      </w:pPr>
-      <w:r>
-        <w:t>Uso de un determinado compilador o plataforma de desarrollo.</w:t>
-      </w:r>
-    </w:p>
-    <w:p>
-      <w:pPr>
-        <w:pStyle w:val="guiazul"/>
-        <w:numPr>
-          <w:ilvl w:val="0"/>
-          <w:numId w:val="8"/>
-        </w:numPr>
-      </w:pPr>
-      <w:r>
-        <w:t>Uso de un determinado sistema operativo.</w:t>
-      </w:r>
-    </w:p>
-    <w:p>
-      <w:pPr>
-        <w:pStyle w:val="Heading2"/>
-      </w:pPr>
-      <w:bookmarkStart w:id="70" w:name="_Toc33411091"/>
-      <w:r>
-        <w:t>Otros requisitos</w:t>
-      </w:r>
-      <w:bookmarkEnd w:id="70"/>
-    </w:p>
-    <w:p>
-      <w:pPr>
-        <w:pStyle w:val="Normalindentado2"/>
-      </w:pPr>
-      <w:r>
-        <w:fldChar w:fldCharType="begin"/>
-      </w:r>
-      <w:r>
-        <w:instrText>MACROBUTTON NoMacro [</w:instrText>
-      </w:r>
-      <w:r>
-        <w:rPr>
-          <w:color w:val="0000FF"/>
-        </w:rPr>
-        <w:instrText>Inserte aquí el texto</w:instrText>
-      </w:r>
-      <w:r>
-        <w:instrText>]</w:instrText>
-      </w:r>
-      <w:r>
-        <w:fldChar w:fldCharType="end"/>
-      </w:r>
-    </w:p>
-    <w:p>
-      <w:pPr>
-        <w:pStyle w:val="guiazul"/>
-        <w:ind w:left="600"/>
-      </w:pPr>
-      <w:r>
-        <w:t>Cualquier otro requisito que no encaje en ninguna de las secciones anteriores.</w:t>
-      </w:r>
-    </w:p>
-    <w:p>
-      <w:pPr>
-        <w:pStyle w:val="guiazul"/>
-        <w:ind w:left="600"/>
-      </w:pPr>
-    </w:p>
-    <w:p>
-      <w:pPr>
-        <w:pStyle w:val="guiazul"/>
-        <w:ind w:left="600"/>
-      </w:pPr>
-      <w:r>
-        <w:t xml:space="preserve">Por ejemplo: </w:t>
-      </w:r>
-    </w:p>
-    <w:p>
-      <w:pPr>
-        <w:pStyle w:val="guiazul"/>
-        <w:ind w:left="600"/>
-      </w:pPr>
-      <w:r>
-        <w:t>Requisitos culturales y políticos</w:t>
-      </w:r>
-    </w:p>
-    <w:p>
-      <w:pPr>
-        <w:pStyle w:val="guiazul"/>
-        <w:ind w:left="600"/>
-      </w:pPr>
-      <w:r>
-        <w:t>Requisitos Legales</w:t>
-      </w:r>
-    </w:p>
-    <w:p>
-      <w:pPr>
-        <w:pStyle w:val="Heading3"/>
-      </w:pPr>
-      <w:bookmarkStart w:id="71" w:name="_Toc33238265"/>
-      <w:bookmarkStart w:id="72" w:name="_Toc33411092"/>
-      <w:r>
-        <w:t>Requisitos legales</w:t>
-      </w:r>
-    </w:p>
-    <w:p>
-      <w:pPr>
-        <w:pStyle w:val="Heading3"/>
-      </w:pPr>
-      <w:r>
-        <w:t>Requisitos culturales</w:t>
-      </w:r>
-    </w:p>
-    <w:p>
-      <w:pPr>
-        <w:pStyle w:val="Heading3"/>
-      </w:pPr>
-      <w:r>
-        <w:t>Otros requisitos</w:t>
-      </w:r>
-    </w:p>
-    <w:p>
-      <w:pPr>
-        <w:pStyle w:val="Heading1"/>
-      </w:pPr>
-      <w:r>
-        <w:t>Apéndices</w:t>
-      </w:r>
-      <w:bookmarkEnd w:id="71"/>
-      <w:bookmarkEnd w:id="72"/>
-    </w:p>
-    <w:p>
-      <w:pPr>
-        <w:pStyle w:val="Normalindentado1"/>
-      </w:pPr>
-      <w:r>
-        <w:fldChar w:fldCharType="begin"/>
-      </w:r>
-      <w:r>
-        <w:instrText>MACROBUTTON NoMacro [</w:instrText>
-      </w:r>
-      <w:r>
-        <w:rPr>
-          <w:color w:val="0000FF"/>
-        </w:rPr>
-        <w:instrText>Inserte aquí el texto</w:instrText>
-      </w:r>
-      <w:r>
-        <w:instrText>]</w:instrText>
-      </w:r>
-      <w:r>
-        <w:fldChar w:fldCharType="end"/>
-      </w:r>
-    </w:p>
-    <w:p>
-      <w:pPr>
-        <w:pStyle w:val="guiazul"/>
-        <w:ind w:left="300"/>
-      </w:pPr>
-      <w:r>
-        <w:t xml:space="preserve">Pueden contener todo tipo de información relevante para la </w:t>
-      </w:r>
-      <w:r>
-        <w:t>DEP</w:t>
-      </w:r>
-      <w:r>
-        <w:t xml:space="preserve"> pero que, propiamente, no forme parte de la </w:t>
-      </w:r>
-      <w:r>
-        <w:t>DEP</w:t>
-      </w:r>
-      <w:r>
-        <w:t>.</w:t>
-      </w:r>
-    </w:p>
-    <w:p>
-      <w:pPr>
-        <w:pStyle w:val="guiazul"/>
-        <w:ind w:left="300"/>
-      </w:pPr>
-      <w:r>
-        <w:t>Un ejemplo de esto serían las demás partes que forman parte de un sistema mas complejo.</w:t>
-      </w:r>
+      </w:pPr>
     </w:p>
     <w:sectPr>
       <w:headerReference w:type="first" r:id="rId22"/>
@@ -13307,16 +15478,6 @@
 </file>
 
 <file path=customXml/item2.xml><?xml version="1.0" encoding="utf-8"?>
-<p:properties xmlns:p="http://schemas.microsoft.com/office/2006/metadata/properties" xmlns:xsi="http://www.w3.org/2001/XMLSchema-instance" xmlns:pc="http://schemas.microsoft.com/office/infopath/2007/PartnerControls">
-  <documentManagement/>
-</p:properties>
-</file>
-
-<file path=customXml/item3.xml><?xml version="1.0" encoding="utf-8"?>
-<b:Sources xmlns:b="http://schemas.openxmlformats.org/officeDocument/2006/bibliography" xmlns="http://schemas.openxmlformats.org/officeDocument/2006/bibliography" SelectedStyle="\APASixthEditionOfficeOnline.xsl" StyleName="APA" Version="6"/>
-</file>
-
-<file path=customXml/item4.xml><?xml version="1.0" encoding="utf-8"?>
 <ct:contentTypeSchema xmlns:ct="http://schemas.microsoft.com/office/2006/metadata/contentType" xmlns:ma="http://schemas.microsoft.com/office/2006/metadata/properties/metaAttributes" ct:_="" ma:_="" ma:contentTypeName="Documento" ma:contentTypeID="0x010100E5174BDD42ACBA48834CEE9AAC43AF6D" ma:contentTypeVersion="3" ma:contentTypeDescription="Crear nuevo documento." ma:contentTypeScope="" ma:versionID="2cfb3bc28820f4520e57af396cb3576d">
   <xsd:schema xmlns:xsd="http://www.w3.org/2001/XMLSchema" xmlns:xs="http://www.w3.org/2001/XMLSchema" xmlns:p="http://schemas.microsoft.com/office/2006/metadata/properties" xmlns:ns2="aeb15c2a-144e-4d5c-992e-d477cb06d4e2" targetNamespace="http://schemas.microsoft.com/office/2006/metadata/properties" ma:root="true" ma:fieldsID="cb8039afe388bd0bf56e54e2388e13b2" ns2:_="">
     <xsd:import namespace="aeb15c2a-144e-4d5c-992e-d477cb06d4e2"/>
@@ -13454,6 +15615,16 @@
 </ct:contentTypeSchema>
 </file>
 
+<file path=customXml/item3.xml><?xml version="1.0" encoding="utf-8"?>
+<b:Sources xmlns:b="http://schemas.openxmlformats.org/officeDocument/2006/bibliography" xmlns="http://schemas.openxmlformats.org/officeDocument/2006/bibliography" SelectedStyle="\APASixthEditionOfficeOnline.xsl" StyleName="APA" Version="6"/>
+</file>
+
+<file path=customXml/item4.xml><?xml version="1.0" encoding="utf-8"?>
+<p:properties xmlns:p="http://schemas.microsoft.com/office/2006/metadata/properties" xmlns:xsi="http://www.w3.org/2001/XMLSchema-instance" xmlns:pc="http://schemas.microsoft.com/office/infopath/2007/PartnerControls">
+  <documentManagement/>
+</p:properties>
+</file>
+
 <file path=customXml/itemProps1.xml><?xml version="1.0" encoding="utf-8"?>
 <ds:datastoreItem xmlns:ds="http://schemas.openxmlformats.org/officeDocument/2006/customXml" ds:itemID="{D0A2A2B0-DF7E-4113-AEAD-0F765FE2C54B}">
   <ds:schemaRefs>
@@ -13463,23 +15634,6 @@
 </file>
 
 <file path=customXml/itemProps2.xml><?xml version="1.0" encoding="utf-8"?>
-<ds:datastoreItem xmlns:ds="http://schemas.openxmlformats.org/officeDocument/2006/customXml" ds:itemID="{E5182DE5-B18C-4C09-9D26-0F9BEE5FA1E0}">
-  <ds:schemaRefs>
-    <ds:schemaRef ds:uri="http://schemas.microsoft.com/office/2006/metadata/properties"/>
-    <ds:schemaRef ds:uri="http://schemas.microsoft.com/office/infopath/2007/PartnerControls"/>
-  </ds:schemaRefs>
-</ds:datastoreItem>
-</file>
-
-<file path=customXml/itemProps3.xml><?xml version="1.0" encoding="utf-8"?>
-<ds:datastoreItem xmlns:ds="http://schemas.openxmlformats.org/officeDocument/2006/customXml" ds:itemID="{950AB4CA-9A2C-4FBB-A0AB-5969D460BA04}">
-  <ds:schemaRefs>
-    <ds:schemaRef ds:uri="http://schemas.openxmlformats.org/officeDocument/2006/bibliography"/>
-  </ds:schemaRefs>
-</ds:datastoreItem>
-</file>
-
-<file path=customXml/itemProps4.xml><?xml version="1.0" encoding="utf-8"?>
 <ds:datastoreItem xmlns:ds="http://schemas.openxmlformats.org/officeDocument/2006/customXml" ds:itemID="{974FE211-7709-46D1-B3FF-9FCEDD4AA972}">
   <ds:schemaRefs>
     <ds:schemaRef ds:uri="http://schemas.microsoft.com/office/2006/metadata/contentType"/>
@@ -13495,4 +15649,21 @@
     <ds:schemaRef ds:uri="http://schemas.microsoft.com/internal/obd"/>
   </ds:schemaRefs>
 </ds:datastoreItem>
+</file>
+
+<file path=customXml/itemProps3.xml><?xml version="1.0" encoding="utf-8"?>
+<ds:datastoreItem xmlns:ds="http://schemas.openxmlformats.org/officeDocument/2006/customXml" ds:itemID="{950AB4CA-9A2C-4FBB-A0AB-5969D460BA04}">
+  <ds:schemaRefs>
+    <ds:schemaRef ds:uri="http://schemas.openxmlformats.org/officeDocument/2006/bibliography"/>
+  </ds:schemaRefs>
+</ds:datastoreItem>
+</file>
+
+<file path=customXml/itemProps4.xml><?xml version="1.0" encoding="utf-8"?>
+<ds:datastoreItem xmlns:ds="http://schemas.openxmlformats.org/officeDocument/2006/customXml" ds:itemID="{E5182DE5-B18C-4C09-9D26-0F9BEE5FA1E0}">
+  <ds:schemaRefs>
+    <ds:schemaRef ds:uri="http://schemas.microsoft.com/office/2006/metadata/properties"/>
+    <ds:schemaRef ds:uri="http://schemas.microsoft.com/office/infopath/2007/PartnerControls"/>
+  </ds:schemaRefs>
+</ds:datastoreItem>
 </file>
</xml_diff>